<commit_message>
Site updated: 2022-01-06 18:47:22
</commit_message>
<xml_diff>
--- a/treasure/download/经藏/宝积部-65部/新建文件夹/佛说观无量寿佛经-刘宋-鍄良耶舍.docx
+++ b/treasure/download/经藏/宝积部-65部/新建文件夹/佛说观无量寿佛经-刘宋-鍄良耶舍.docx
@@ -24,7 +24,7 @@
     <w:p>
       <w:pPr>
         <w:rPr>
-          <w:rFonts w:ascii="楷体" w:eastAsia="楷体" w:hAnsi="楷体" w:hint="eastAsia"/>
+          <w:rFonts w:ascii="楷体" w:eastAsia="楷体" w:hAnsi="楷体"/>
           <w:sz w:val="24"/>
           <w:szCs w:val="24"/>
           <w:shd w:val="pct15" w:color="auto" w:fill="FFFFFF"/>
@@ -2185,1249 +2185,1239 @@
         </w:rPr>
         <w:t>。</w:t>
       </w:r>
+      <w:r>
+        <w:rPr>
+          <w:rFonts w:ascii="楷体" w:eastAsia="楷体" w:hAnsi="楷体" w:hint="eastAsia"/>
+          <w:sz w:val="24"/>
+          <w:szCs w:val="24"/>
+          <w:shd w:val="pct15" w:color="auto" w:fill="FFFFFF"/>
+        </w:rPr>
+        <w:t>礼佛而退。</w:t>
+      </w:r>
+    </w:p>
+    <w:p>
+      <w:pPr>
+        <w:ind w:firstLineChars="400" w:firstLine="960"/>
+        <w:rPr>
+          <w:rFonts w:ascii="楷体" w:eastAsia="楷体" w:hAnsi="楷体"/>
+          <w:sz w:val="24"/>
+          <w:szCs w:val="24"/>
+          <w:shd w:val="pct15" w:color="auto" w:fill="FFFFFF"/>
+        </w:rPr>
+      </w:pPr>
+    </w:p>
+    <w:p>
+      <w:pPr>
+        <w:ind w:firstLineChars="400" w:firstLine="960"/>
+        <w:rPr>
+          <w:rFonts w:ascii="楷体" w:eastAsia="楷体" w:hAnsi="楷体"/>
+          <w:sz w:val="24"/>
+          <w:szCs w:val="24"/>
+          <w:shd w:val="pct15" w:color="auto" w:fill="FFFFFF"/>
+        </w:rPr>
+      </w:pPr>
+      <w:r>
+        <w:rPr>
+          <w:rFonts w:ascii="楷体" w:eastAsia="楷体" w:hAnsi="楷体" w:hint="eastAsia"/>
+          <w:sz w:val="24"/>
+          <w:szCs w:val="24"/>
+          <w:shd w:val="pct15" w:color="auto" w:fill="FFFFFF"/>
+        </w:rPr>
+        <w:t>御制无量寿佛赞</w:t>
+      </w:r>
+    </w:p>
+    <w:p>
+      <w:pPr>
+        <w:ind w:firstLineChars="200" w:firstLine="480"/>
+        <w:rPr>
+          <w:rFonts w:ascii="楷体" w:eastAsia="楷体" w:hAnsi="楷体"/>
+          <w:sz w:val="24"/>
+          <w:szCs w:val="24"/>
+          <w:shd w:val="pct15" w:color="auto" w:fill="FFFFFF"/>
+        </w:rPr>
+      </w:pPr>
+      <w:r>
+        <w:rPr>
+          <w:rFonts w:ascii="楷体" w:eastAsia="楷体" w:hAnsi="楷体" w:hint="eastAsia"/>
+          <w:sz w:val="24"/>
+          <w:szCs w:val="24"/>
+          <w:shd w:val="pct15" w:color="auto" w:fill="FFFFFF"/>
+        </w:rPr>
+        <w:t>西方极乐世界尊。</w:t>
+      </w:r>
+      <w:r>
+        <w:rPr>
+          <w:rFonts w:ascii="楷体" w:eastAsia="楷体" w:hAnsi="楷体" w:hint="eastAsia"/>
+          <w:sz w:val="24"/>
+          <w:szCs w:val="24"/>
+          <w:shd w:val="pct15" w:color="auto" w:fill="FFFFFF"/>
+        </w:rPr>
+        <w:t>无量寿佛世希有</w:t>
+      </w:r>
+      <w:r>
+        <w:rPr>
+          <w:rFonts w:ascii="楷体" w:eastAsia="楷体" w:hAnsi="楷体" w:hint="eastAsia"/>
+          <w:sz w:val="24"/>
+          <w:szCs w:val="24"/>
+          <w:shd w:val="pct15" w:color="auto" w:fill="FFFFFF"/>
+        </w:rPr>
+        <w:t>。</w:t>
+      </w:r>
+      <w:r>
+        <w:rPr>
+          <w:rFonts w:ascii="楷体" w:eastAsia="楷体" w:hAnsi="楷体" w:hint="eastAsia"/>
+          <w:sz w:val="24"/>
+          <w:szCs w:val="24"/>
+          <w:shd w:val="pct15" w:color="auto" w:fill="FFFFFF"/>
+        </w:rPr>
+        <w:t>能灭无始亿劫业</w:t>
+      </w:r>
+      <w:r>
+        <w:rPr>
+          <w:rFonts w:ascii="楷体" w:eastAsia="楷体" w:hAnsi="楷体" w:hint="eastAsia"/>
+          <w:sz w:val="24"/>
+          <w:szCs w:val="24"/>
+          <w:shd w:val="pct15" w:color="auto" w:fill="FFFFFF"/>
+        </w:rPr>
+        <w:t>。</w:t>
+      </w:r>
+      <w:r>
+        <w:rPr>
+          <w:rFonts w:ascii="楷体" w:eastAsia="楷体" w:hAnsi="楷体" w:hint="eastAsia"/>
+          <w:sz w:val="24"/>
+          <w:szCs w:val="24"/>
+          <w:shd w:val="pct15" w:color="auto" w:fill="FFFFFF"/>
+        </w:rPr>
+        <w:t>令彼苦恼悉消除</w:t>
+      </w:r>
+      <w:r>
+        <w:rPr>
+          <w:rFonts w:ascii="楷体" w:eastAsia="楷体" w:hAnsi="楷体" w:hint="eastAsia"/>
+          <w:sz w:val="24"/>
+          <w:szCs w:val="24"/>
+          <w:shd w:val="pct15" w:color="auto" w:fill="FFFFFF"/>
+        </w:rPr>
+        <w:t>。</w:t>
+      </w:r>
+    </w:p>
+    <w:p>
+      <w:pPr>
+        <w:ind w:firstLineChars="200" w:firstLine="480"/>
+        <w:rPr>
+          <w:rFonts w:ascii="楷体" w:eastAsia="楷体" w:hAnsi="楷体"/>
+          <w:sz w:val="24"/>
+          <w:szCs w:val="24"/>
+          <w:shd w:val="pct15" w:color="auto" w:fill="FFFFFF"/>
+        </w:rPr>
+      </w:pPr>
+      <w:r>
+        <w:rPr>
+          <w:rFonts w:ascii="楷体" w:eastAsia="楷体" w:hAnsi="楷体" w:hint="eastAsia"/>
+          <w:sz w:val="24"/>
+          <w:szCs w:val="24"/>
+          <w:shd w:val="pct15" w:color="auto" w:fill="FFFFFF"/>
+        </w:rPr>
+        <w:t>若人能以微妙心。</w:t>
+      </w:r>
+      <w:r>
+        <w:rPr>
+          <w:rFonts w:ascii="楷体" w:eastAsia="楷体" w:hAnsi="楷体" w:hint="eastAsia"/>
+          <w:sz w:val="24"/>
+          <w:szCs w:val="24"/>
+          <w:shd w:val="pct15" w:color="auto" w:fill="FFFFFF"/>
+        </w:rPr>
+        <w:t>尝以极乐为观想</w:t>
+      </w:r>
+      <w:r>
+        <w:rPr>
+          <w:rFonts w:ascii="楷体" w:eastAsia="楷体" w:hAnsi="楷体" w:hint="eastAsia"/>
+          <w:sz w:val="24"/>
+          <w:szCs w:val="24"/>
+          <w:shd w:val="pct15" w:color="auto" w:fill="FFFFFF"/>
+        </w:rPr>
+        <w:t>。广与众生分别说。</w:t>
+      </w:r>
+      <w:r>
+        <w:rPr>
+          <w:rFonts w:ascii="楷体" w:eastAsia="楷体" w:hAnsi="楷体" w:hint="eastAsia"/>
+          <w:sz w:val="24"/>
+          <w:szCs w:val="24"/>
+          <w:shd w:val="pct15" w:color="auto" w:fill="FFFFFF"/>
+        </w:rPr>
+        <w:t>举目即见阿弥陀</w:t>
+      </w:r>
+      <w:r>
+        <w:rPr>
+          <w:rFonts w:ascii="楷体" w:eastAsia="楷体" w:hAnsi="楷体" w:hint="eastAsia"/>
+          <w:sz w:val="24"/>
+          <w:szCs w:val="24"/>
+          <w:shd w:val="pct15" w:color="auto" w:fill="FFFFFF"/>
+        </w:rPr>
+        <w:t>。</w:t>
+      </w:r>
+    </w:p>
+    <w:p>
+      <w:pPr>
+        <w:ind w:firstLineChars="200" w:firstLine="480"/>
+        <w:rPr>
+          <w:rFonts w:ascii="楷体" w:eastAsia="楷体" w:hAnsi="楷体"/>
+          <w:sz w:val="24"/>
+          <w:szCs w:val="24"/>
+          <w:shd w:val="pct15" w:color="auto" w:fill="FFFFFF"/>
+        </w:rPr>
+      </w:pPr>
+      <w:r>
+        <w:rPr>
+          <w:rFonts w:ascii="楷体" w:eastAsia="楷体" w:hAnsi="楷体" w:hint="eastAsia"/>
+          <w:sz w:val="24"/>
+          <w:szCs w:val="24"/>
+          <w:shd w:val="pct15" w:color="auto" w:fill="FFFFFF"/>
+        </w:rPr>
+        <w:t>佛身色相显光明。</w:t>
+      </w:r>
+      <w:r>
+        <w:rPr>
+          <w:rFonts w:ascii="楷体" w:eastAsia="楷体" w:hAnsi="楷体" w:hint="eastAsia"/>
+          <w:sz w:val="24"/>
+          <w:szCs w:val="24"/>
+          <w:shd w:val="pct15" w:color="auto" w:fill="FFFFFF"/>
+        </w:rPr>
+        <w:t>阎浮檀金无与等</w:t>
+      </w:r>
+      <w:r>
+        <w:rPr>
+          <w:rFonts w:ascii="楷体" w:eastAsia="楷体" w:hAnsi="楷体" w:hint="eastAsia"/>
+          <w:sz w:val="24"/>
+          <w:szCs w:val="24"/>
+          <w:shd w:val="pct15" w:color="auto" w:fill="FFFFFF"/>
+        </w:rPr>
+        <w:t>。</w:t>
+      </w:r>
+      <w:r>
+        <w:rPr>
+          <w:rFonts w:ascii="楷体" w:eastAsia="楷体" w:hAnsi="楷体" w:hint="eastAsia"/>
+          <w:sz w:val="24"/>
+          <w:szCs w:val="24"/>
+          <w:shd w:val="pct15" w:color="auto" w:fill="FFFFFF"/>
+        </w:rPr>
+        <w:t>其高无比由旬数</w:t>
+      </w:r>
+      <w:r>
+        <w:rPr>
+          <w:rFonts w:ascii="楷体" w:eastAsia="楷体" w:hAnsi="楷体" w:hint="eastAsia"/>
+          <w:sz w:val="24"/>
+          <w:szCs w:val="24"/>
+          <w:shd w:val="pct15" w:color="auto" w:fill="FFFFFF"/>
+        </w:rPr>
+        <w:t>。</w:t>
+      </w:r>
+      <w:r>
+        <w:rPr>
+          <w:rFonts w:ascii="楷体" w:eastAsia="楷体" w:hAnsi="楷体" w:hint="eastAsia"/>
+          <w:sz w:val="24"/>
+          <w:szCs w:val="24"/>
+          <w:shd w:val="pct15" w:color="auto" w:fill="FFFFFF"/>
+        </w:rPr>
+        <w:t>六十万亿那由他</w:t>
+      </w:r>
+      <w:r>
+        <w:rPr>
+          <w:rFonts w:ascii="楷体" w:eastAsia="楷体" w:hAnsi="楷体" w:hint="eastAsia"/>
+          <w:sz w:val="24"/>
+          <w:szCs w:val="24"/>
+          <w:shd w:val="pct15" w:color="auto" w:fill="FFFFFF"/>
+        </w:rPr>
+        <w:t>。</w:t>
+      </w:r>
+    </w:p>
+    <w:p>
+      <w:pPr>
+        <w:ind w:firstLineChars="200" w:firstLine="480"/>
+        <w:rPr>
+          <w:rFonts w:ascii="楷体" w:eastAsia="楷体" w:hAnsi="楷体"/>
+          <w:sz w:val="24"/>
+          <w:szCs w:val="24"/>
+          <w:shd w:val="pct15" w:color="auto" w:fill="FFFFFF"/>
+        </w:rPr>
+      </w:pPr>
+      <w:r>
+        <w:rPr>
+          <w:rFonts w:ascii="楷体" w:eastAsia="楷体" w:hAnsi="楷体" w:hint="eastAsia"/>
+          <w:sz w:val="24"/>
+          <w:szCs w:val="24"/>
+          <w:shd w:val="pct15" w:color="auto" w:fill="FFFFFF"/>
+        </w:rPr>
+        <w:t>眉间白毫五须弥</w:t>
+      </w:r>
+      <w:r>
+        <w:rPr>
+          <w:rFonts w:ascii="楷体" w:eastAsia="楷体" w:hAnsi="楷体" w:hint="eastAsia"/>
+          <w:sz w:val="24"/>
+          <w:szCs w:val="24"/>
+          <w:shd w:val="pct15" w:color="auto" w:fill="FFFFFF"/>
+        </w:rPr>
+        <w:t>。</w:t>
+      </w:r>
+      <w:r>
+        <w:rPr>
+          <w:rFonts w:ascii="楷体" w:eastAsia="楷体" w:hAnsi="楷体" w:hint="eastAsia"/>
+          <w:sz w:val="24"/>
+          <w:szCs w:val="24"/>
+          <w:shd w:val="pct15" w:color="auto" w:fill="FFFFFF"/>
+        </w:rPr>
+        <w:t>绀眼弘澄四大海</w:t>
+      </w:r>
+      <w:r>
+        <w:rPr>
+          <w:rFonts w:ascii="楷体" w:eastAsia="楷体" w:hAnsi="楷体" w:hint="eastAsia"/>
+          <w:sz w:val="24"/>
+          <w:szCs w:val="24"/>
+          <w:shd w:val="pct15" w:color="auto" w:fill="FFFFFF"/>
+        </w:rPr>
+        <w:t>。</w:t>
+      </w:r>
+      <w:r>
+        <w:rPr>
+          <w:rFonts w:ascii="楷体" w:eastAsia="楷体" w:hAnsi="楷体" w:hint="eastAsia"/>
+          <w:sz w:val="24"/>
+          <w:szCs w:val="24"/>
+          <w:shd w:val="pct15" w:color="auto" w:fill="FFFFFF"/>
+        </w:rPr>
+        <w:t>光明演出诸毛孔</w:t>
+      </w:r>
+      <w:r>
+        <w:rPr>
+          <w:rFonts w:ascii="楷体" w:eastAsia="楷体" w:hAnsi="楷体" w:hint="eastAsia"/>
+          <w:sz w:val="24"/>
+          <w:szCs w:val="24"/>
+          <w:shd w:val="pct15" w:color="auto" w:fill="FFFFFF"/>
+        </w:rPr>
+        <w:t>。</w:t>
+      </w:r>
+      <w:r>
+        <w:rPr>
+          <w:rFonts w:ascii="楷体" w:eastAsia="楷体" w:hAnsi="楷体" w:hint="eastAsia"/>
+          <w:sz w:val="24"/>
+          <w:szCs w:val="24"/>
+          <w:shd w:val="pct15" w:color="auto" w:fill="FFFFFF"/>
+        </w:rPr>
+        <w:t>一孔遍含诸大千</w:t>
+      </w:r>
+      <w:r>
+        <w:rPr>
+          <w:rFonts w:ascii="楷体" w:eastAsia="楷体" w:hAnsi="楷体" w:hint="eastAsia"/>
+          <w:sz w:val="24"/>
+          <w:szCs w:val="24"/>
+          <w:shd w:val="pct15" w:color="auto" w:fill="FFFFFF"/>
+        </w:rPr>
+        <w:t>。</w:t>
+      </w:r>
+    </w:p>
+    <w:p>
+      <w:pPr>
+        <w:ind w:firstLineChars="200" w:firstLine="480"/>
+        <w:rPr>
+          <w:rFonts w:ascii="楷体" w:eastAsia="楷体" w:hAnsi="楷体"/>
+          <w:sz w:val="24"/>
+          <w:szCs w:val="24"/>
+          <w:shd w:val="pct15" w:color="auto" w:fill="FFFFFF"/>
+        </w:rPr>
+      </w:pPr>
+      <w:r>
+        <w:rPr>
+          <w:rFonts w:ascii="楷体" w:eastAsia="楷体" w:hAnsi="楷体" w:hint="eastAsia"/>
+          <w:sz w:val="24"/>
+          <w:szCs w:val="24"/>
+          <w:shd w:val="pct15" w:color="auto" w:fill="FFFFFF"/>
+        </w:rPr>
+        <w:t>一界中有一河沙</w:t>
+      </w:r>
+      <w:r>
+        <w:rPr>
+          <w:rFonts w:ascii="楷体" w:eastAsia="楷体" w:hAnsi="楷体" w:hint="eastAsia"/>
+          <w:sz w:val="24"/>
+          <w:szCs w:val="24"/>
+          <w:shd w:val="pct15" w:color="auto" w:fill="FFFFFF"/>
+        </w:rPr>
+        <w:t>。</w:t>
+      </w:r>
+      <w:r>
+        <w:rPr>
+          <w:rFonts w:ascii="楷体" w:eastAsia="楷体" w:hAnsi="楷体" w:hint="eastAsia"/>
+          <w:sz w:val="24"/>
+          <w:szCs w:val="24"/>
+          <w:shd w:val="pct15" w:color="auto" w:fill="FFFFFF"/>
+        </w:rPr>
+        <w:t>沙有八万四千相</w:t>
+      </w:r>
+      <w:r>
+        <w:rPr>
+          <w:rFonts w:ascii="楷体" w:eastAsia="楷体" w:hAnsi="楷体" w:hint="eastAsia"/>
+          <w:sz w:val="24"/>
+          <w:szCs w:val="24"/>
+          <w:shd w:val="pct15" w:color="auto" w:fill="FFFFFF"/>
+        </w:rPr>
+        <w:t>。</w:t>
+      </w:r>
+      <w:r>
+        <w:rPr>
+          <w:rFonts w:ascii="楷体" w:eastAsia="楷体" w:hAnsi="楷体" w:hint="eastAsia"/>
+          <w:sz w:val="24"/>
+          <w:szCs w:val="24"/>
+          <w:shd w:val="pct15" w:color="auto" w:fill="FFFFFF"/>
+        </w:rPr>
+        <w:t>一一相中复如是</w:t>
+      </w:r>
+      <w:r>
+        <w:rPr>
+          <w:rFonts w:ascii="楷体" w:eastAsia="楷体" w:hAnsi="楷体" w:hint="eastAsia"/>
+          <w:sz w:val="24"/>
+          <w:szCs w:val="24"/>
+          <w:shd w:val="pct15" w:color="auto" w:fill="FFFFFF"/>
+        </w:rPr>
+        <w:t>。</w:t>
+      </w:r>
+      <w:r>
+        <w:rPr>
+          <w:rFonts w:ascii="楷体" w:eastAsia="楷体" w:hAnsi="楷体" w:hint="eastAsia"/>
+          <w:sz w:val="24"/>
+          <w:szCs w:val="24"/>
+          <w:shd w:val="pct15" w:color="auto" w:fill="FFFFFF"/>
+        </w:rPr>
+        <w:t>作者观者随现前</w:t>
+      </w:r>
+      <w:r>
+        <w:rPr>
+          <w:rFonts w:ascii="楷体" w:eastAsia="楷体" w:hAnsi="楷体" w:hint="eastAsia"/>
+          <w:sz w:val="24"/>
+          <w:szCs w:val="24"/>
+          <w:shd w:val="pct15" w:color="auto" w:fill="FFFFFF"/>
+        </w:rPr>
+        <w:t>。</w:t>
+      </w:r>
+    </w:p>
+    <w:p>
+      <w:pPr>
+        <w:ind w:firstLineChars="200" w:firstLine="480"/>
+        <w:rPr>
+          <w:rFonts w:ascii="楷体" w:eastAsia="楷体" w:hAnsi="楷体"/>
+          <w:sz w:val="24"/>
+          <w:szCs w:val="24"/>
+          <w:shd w:val="pct15" w:color="auto" w:fill="FFFFFF"/>
+        </w:rPr>
+      </w:pPr>
+      <w:r>
+        <w:rPr>
+          <w:rFonts w:ascii="楷体" w:eastAsia="楷体" w:hAnsi="楷体" w:hint="eastAsia"/>
+          <w:sz w:val="24"/>
+          <w:szCs w:val="24"/>
+          <w:shd w:val="pct15" w:color="auto" w:fill="FFFFFF"/>
+        </w:rPr>
+        <w:t>以观佛身见佛心</w:t>
+      </w:r>
+      <w:r>
+        <w:rPr>
+          <w:rFonts w:ascii="楷体" w:eastAsia="楷体" w:hAnsi="楷体" w:hint="eastAsia"/>
+          <w:sz w:val="24"/>
+          <w:szCs w:val="24"/>
+          <w:shd w:val="pct15" w:color="auto" w:fill="FFFFFF"/>
+        </w:rPr>
+        <w:t>。</w:t>
+      </w:r>
+      <w:r>
+        <w:rPr>
+          <w:rFonts w:ascii="楷体" w:eastAsia="楷体" w:hAnsi="楷体" w:hint="eastAsia"/>
+          <w:sz w:val="24"/>
+          <w:szCs w:val="24"/>
+          <w:shd w:val="pct15" w:color="auto" w:fill="FFFFFF"/>
+        </w:rPr>
+        <w:t>众生忆想见化佛</w:t>
+      </w:r>
+      <w:r>
+        <w:rPr>
+          <w:rFonts w:ascii="楷体" w:eastAsia="楷体" w:hAnsi="楷体" w:hint="eastAsia"/>
+          <w:sz w:val="24"/>
+          <w:szCs w:val="24"/>
+          <w:shd w:val="pct15" w:color="auto" w:fill="FFFFFF"/>
+        </w:rPr>
+        <w:t>。</w:t>
+      </w:r>
+      <w:r>
+        <w:rPr>
+          <w:rFonts w:ascii="楷体" w:eastAsia="楷体" w:hAnsi="楷体" w:hint="eastAsia"/>
+          <w:sz w:val="24"/>
+          <w:szCs w:val="24"/>
+          <w:shd w:val="pct15" w:color="auto" w:fill="FFFFFF"/>
+        </w:rPr>
+        <w:t>从相入得无生忍</w:t>
+      </w:r>
+      <w:r>
+        <w:rPr>
+          <w:rFonts w:ascii="楷体" w:eastAsia="楷体" w:hAnsi="楷体" w:hint="eastAsia"/>
+          <w:sz w:val="24"/>
+          <w:szCs w:val="24"/>
+          <w:shd w:val="pct15" w:color="auto" w:fill="FFFFFF"/>
+        </w:rPr>
+        <w:t>。</w:t>
+      </w:r>
+      <w:r>
+        <w:rPr>
+          <w:rFonts w:ascii="楷体" w:eastAsia="楷体" w:hAnsi="楷体" w:hint="eastAsia"/>
+          <w:sz w:val="24"/>
+          <w:szCs w:val="24"/>
+          <w:shd w:val="pct15" w:color="auto" w:fill="FFFFFF"/>
+        </w:rPr>
+        <w:t>以三昧受无边慈</w:t>
+      </w:r>
+      <w:r>
+        <w:rPr>
+          <w:rFonts w:ascii="楷体" w:eastAsia="楷体" w:hAnsi="楷体" w:hint="eastAsia"/>
+          <w:sz w:val="24"/>
+          <w:szCs w:val="24"/>
+          <w:shd w:val="pct15" w:color="auto" w:fill="FFFFFF"/>
+        </w:rPr>
+        <w:t>。</w:t>
+      </w:r>
+    </w:p>
+    <w:p>
+      <w:pPr>
+        <w:ind w:firstLineChars="200" w:firstLine="480"/>
+        <w:rPr>
+          <w:rFonts w:ascii="楷体" w:eastAsia="楷体" w:hAnsi="楷体"/>
+          <w:sz w:val="24"/>
+          <w:szCs w:val="24"/>
+          <w:shd w:val="pct15" w:color="auto" w:fill="FFFFFF"/>
+        </w:rPr>
+      </w:pPr>
+      <w:r>
+        <w:rPr>
+          <w:rFonts w:ascii="楷体" w:eastAsia="楷体" w:hAnsi="楷体" w:hint="eastAsia"/>
+          <w:sz w:val="24"/>
+          <w:szCs w:val="24"/>
+          <w:shd w:val="pct15" w:color="auto" w:fill="FFFFFF"/>
+        </w:rPr>
+        <w:t>佛身无量广无边。</w:t>
+      </w:r>
+      <w:r>
+        <w:rPr>
+          <w:rFonts w:ascii="楷体" w:eastAsia="楷体" w:hAnsi="楷体" w:hint="eastAsia"/>
+          <w:sz w:val="24"/>
+          <w:szCs w:val="24"/>
+          <w:shd w:val="pct15" w:color="auto" w:fill="FFFFFF"/>
+        </w:rPr>
+        <w:t>化导以彼宿愿力</w:t>
+      </w:r>
+      <w:r>
+        <w:rPr>
+          <w:rFonts w:ascii="楷体" w:eastAsia="楷体" w:hAnsi="楷体" w:hint="eastAsia"/>
+          <w:sz w:val="24"/>
+          <w:szCs w:val="24"/>
+          <w:shd w:val="pct15" w:color="auto" w:fill="FFFFFF"/>
+        </w:rPr>
+        <w:t>。</w:t>
+      </w:r>
+      <w:r>
+        <w:rPr>
+          <w:rFonts w:ascii="楷体" w:eastAsia="楷体" w:hAnsi="楷体" w:hint="eastAsia"/>
+          <w:sz w:val="24"/>
+          <w:szCs w:val="24"/>
+          <w:shd w:val="pct15" w:color="auto" w:fill="FFFFFF"/>
+        </w:rPr>
+        <w:t>有忆想者得成就</w:t>
+      </w:r>
+      <w:r>
+        <w:rPr>
+          <w:rFonts w:ascii="楷体" w:eastAsia="楷体" w:hAnsi="楷体" w:hint="eastAsia"/>
+          <w:sz w:val="24"/>
+          <w:szCs w:val="24"/>
+          <w:shd w:val="pct15" w:color="auto" w:fill="FFFFFF"/>
+        </w:rPr>
+        <w:t>。</w:t>
+      </w:r>
+      <w:r>
+        <w:rPr>
+          <w:rFonts w:ascii="楷体" w:eastAsia="楷体" w:hAnsi="楷体" w:hint="eastAsia"/>
+          <w:sz w:val="24"/>
+          <w:szCs w:val="24"/>
+          <w:shd w:val="pct15" w:color="auto" w:fill="FFFFFF"/>
+        </w:rPr>
+        <w:t>神通如意满虚空</w:t>
+      </w:r>
+      <w:r>
+        <w:rPr>
+          <w:rFonts w:ascii="楷体" w:eastAsia="楷体" w:hAnsi="楷体" w:hint="eastAsia"/>
+          <w:sz w:val="24"/>
+          <w:szCs w:val="24"/>
+          <w:shd w:val="pct15" w:color="auto" w:fill="FFFFFF"/>
+        </w:rPr>
+        <w:t>。</w:t>
+      </w:r>
+    </w:p>
+    <w:p>
+      <w:pPr>
+        <w:ind w:firstLineChars="200" w:firstLine="480"/>
+        <w:rPr>
+          <w:rFonts w:ascii="楷体" w:eastAsia="楷体" w:hAnsi="楷体"/>
+          <w:sz w:val="24"/>
+          <w:szCs w:val="24"/>
+          <w:shd w:val="pct15" w:color="auto" w:fill="FFFFFF"/>
+        </w:rPr>
+      </w:pPr>
+      <w:r>
+        <w:rPr>
+          <w:rFonts w:ascii="楷体" w:eastAsia="楷体" w:hAnsi="楷体" w:hint="eastAsia"/>
+          <w:sz w:val="24"/>
+          <w:szCs w:val="24"/>
+          <w:shd w:val="pct15" w:color="auto" w:fill="FFFFFF"/>
+        </w:rPr>
+        <w:t>众生三种具三心</w:t>
+      </w:r>
+      <w:r>
+        <w:rPr>
+          <w:rFonts w:ascii="楷体" w:eastAsia="楷体" w:hAnsi="楷体" w:hint="eastAsia"/>
+          <w:sz w:val="24"/>
+          <w:szCs w:val="24"/>
+          <w:shd w:val="pct15" w:color="auto" w:fill="FFFFFF"/>
+        </w:rPr>
+        <w:t>。</w:t>
+      </w:r>
+      <w:r>
+        <w:rPr>
+          <w:rFonts w:ascii="楷体" w:eastAsia="楷体" w:hAnsi="楷体" w:hint="eastAsia"/>
+          <w:sz w:val="24"/>
+          <w:szCs w:val="24"/>
+          <w:shd w:val="pct15" w:color="auto" w:fill="FFFFFF"/>
+        </w:rPr>
+        <w:t>精进勇猛无退转</w:t>
+      </w:r>
+      <w:r>
+        <w:rPr>
+          <w:rFonts w:ascii="楷体" w:eastAsia="楷体" w:hAnsi="楷体" w:hint="eastAsia"/>
+          <w:sz w:val="24"/>
+          <w:szCs w:val="24"/>
+          <w:shd w:val="pct15" w:color="auto" w:fill="FFFFFF"/>
+        </w:rPr>
+        <w:t>。</w:t>
+      </w:r>
+      <w:r>
+        <w:rPr>
+          <w:rFonts w:ascii="楷体" w:eastAsia="楷体" w:hAnsi="楷体" w:hint="eastAsia"/>
+          <w:sz w:val="24"/>
+          <w:szCs w:val="24"/>
+          <w:shd w:val="pct15" w:color="auto" w:fill="FFFFFF"/>
+        </w:rPr>
+        <w:t>即得如来手接引</w:t>
+      </w:r>
+      <w:r>
+        <w:rPr>
+          <w:rFonts w:ascii="楷体" w:eastAsia="楷体" w:hAnsi="楷体" w:hint="eastAsia"/>
+          <w:sz w:val="24"/>
+          <w:szCs w:val="24"/>
+          <w:shd w:val="pct15" w:color="auto" w:fill="FFFFFF"/>
+        </w:rPr>
+        <w:t>。</w:t>
+      </w:r>
+      <w:r>
+        <w:rPr>
+          <w:rFonts w:ascii="楷体" w:eastAsia="楷体" w:hAnsi="楷体" w:hint="eastAsia"/>
+          <w:sz w:val="24"/>
+          <w:szCs w:val="24"/>
+          <w:shd w:val="pct15" w:color="auto" w:fill="FFFFFF"/>
+        </w:rPr>
+        <w:t>七宝宫殿大光明</w:t>
+      </w:r>
+      <w:r>
+        <w:rPr>
+          <w:rFonts w:ascii="楷体" w:eastAsia="楷体" w:hAnsi="楷体" w:hint="eastAsia"/>
+          <w:sz w:val="24"/>
+          <w:szCs w:val="24"/>
+          <w:shd w:val="pct15" w:color="auto" w:fill="FFFFFF"/>
+        </w:rPr>
+        <w:t>。</w:t>
+      </w:r>
+    </w:p>
+    <w:p>
+      <w:pPr>
+        <w:ind w:firstLineChars="200" w:firstLine="480"/>
+        <w:rPr>
+          <w:rFonts w:ascii="楷体" w:eastAsia="楷体" w:hAnsi="楷体"/>
+          <w:sz w:val="24"/>
+          <w:szCs w:val="24"/>
+          <w:shd w:val="pct15" w:color="auto" w:fill="FFFFFF"/>
+        </w:rPr>
+      </w:pPr>
+      <w:r>
+        <w:rPr>
+          <w:rFonts w:ascii="楷体" w:eastAsia="楷体" w:hAnsi="楷体" w:hint="eastAsia"/>
+          <w:sz w:val="24"/>
+          <w:szCs w:val="24"/>
+          <w:shd w:val="pct15" w:color="auto" w:fill="FFFFFF"/>
+        </w:rPr>
+        <w:t>其身踊跃金刚台</w:t>
+      </w:r>
+      <w:r>
+        <w:rPr>
+          <w:rFonts w:ascii="楷体" w:eastAsia="楷体" w:hAnsi="楷体" w:hint="eastAsia"/>
+          <w:sz w:val="24"/>
+          <w:szCs w:val="24"/>
+          <w:shd w:val="pct15" w:color="auto" w:fill="FFFFFF"/>
+        </w:rPr>
+        <w:t>。</w:t>
+      </w:r>
+      <w:r>
+        <w:rPr>
+          <w:rFonts w:ascii="楷体" w:eastAsia="楷体" w:hAnsi="楷体" w:hint="eastAsia"/>
+          <w:sz w:val="24"/>
+          <w:szCs w:val="24"/>
+          <w:shd w:val="pct15" w:color="auto" w:fill="FFFFFF"/>
+        </w:rPr>
+        <w:t>随从佛后弹指顷</w:t>
+      </w:r>
+      <w:r>
+        <w:rPr>
+          <w:rFonts w:ascii="楷体" w:eastAsia="楷体" w:hAnsi="楷体" w:hint="eastAsia"/>
+          <w:sz w:val="24"/>
+          <w:szCs w:val="24"/>
+          <w:shd w:val="pct15" w:color="auto" w:fill="FFFFFF"/>
+        </w:rPr>
+        <w:t>。</w:t>
+      </w:r>
+      <w:r>
+        <w:rPr>
+          <w:rFonts w:ascii="楷体" w:eastAsia="楷体" w:hAnsi="楷体" w:hint="eastAsia"/>
+          <w:sz w:val="24"/>
+          <w:szCs w:val="24"/>
+          <w:shd w:val="pct15" w:color="auto" w:fill="FFFFFF"/>
+        </w:rPr>
+        <w:t>行大乘解第一义</w:t>
+      </w:r>
+      <w:r>
+        <w:rPr>
+          <w:rFonts w:ascii="楷体" w:eastAsia="楷体" w:hAnsi="楷体" w:hint="eastAsia"/>
+          <w:sz w:val="24"/>
+          <w:szCs w:val="24"/>
+          <w:shd w:val="pct15" w:color="auto" w:fill="FFFFFF"/>
+        </w:rPr>
+        <w:t>。</w:t>
+      </w:r>
+      <w:r>
+        <w:rPr>
+          <w:rFonts w:ascii="楷体" w:eastAsia="楷体" w:hAnsi="楷体" w:hint="eastAsia"/>
+          <w:sz w:val="24"/>
+          <w:szCs w:val="24"/>
+          <w:shd w:val="pct15" w:color="auto" w:fill="FFFFFF"/>
+        </w:rPr>
+        <w:t>即生七宝莲池中</w:t>
+      </w:r>
+      <w:r>
+        <w:rPr>
+          <w:rFonts w:ascii="楷体" w:eastAsia="楷体" w:hAnsi="楷体" w:hint="eastAsia"/>
+          <w:sz w:val="24"/>
+          <w:szCs w:val="24"/>
+          <w:shd w:val="pct15" w:color="auto" w:fill="FFFFFF"/>
+        </w:rPr>
+        <w:t>。</w:t>
+      </w:r>
+    </w:p>
+    <w:p>
+      <w:pPr>
+        <w:ind w:firstLineChars="200" w:firstLine="480"/>
+        <w:rPr>
+          <w:rFonts w:ascii="楷体" w:eastAsia="楷体" w:hAnsi="楷体"/>
+          <w:sz w:val="24"/>
+          <w:szCs w:val="24"/>
+          <w:shd w:val="pct15" w:color="auto" w:fill="FFFFFF"/>
+        </w:rPr>
+      </w:pPr>
+      <w:r>
+        <w:rPr>
+          <w:rFonts w:ascii="楷体" w:eastAsia="楷体" w:hAnsi="楷体" w:hint="eastAsia"/>
+          <w:sz w:val="24"/>
+          <w:szCs w:val="24"/>
+          <w:shd w:val="pct15" w:color="auto" w:fill="FFFFFF"/>
+        </w:rPr>
+        <w:t>阿弥陀佛大慈悲</w:t>
+      </w:r>
+      <w:r>
+        <w:rPr>
+          <w:rFonts w:ascii="楷体" w:eastAsia="楷体" w:hAnsi="楷体" w:hint="eastAsia"/>
+          <w:sz w:val="24"/>
+          <w:szCs w:val="24"/>
+          <w:shd w:val="pct15" w:color="auto" w:fill="FFFFFF"/>
+        </w:rPr>
+        <w:t>。</w:t>
+      </w:r>
+      <w:r>
+        <w:rPr>
+          <w:rFonts w:ascii="楷体" w:eastAsia="楷体" w:hAnsi="楷体" w:hint="eastAsia"/>
+          <w:sz w:val="24"/>
+          <w:szCs w:val="24"/>
+          <w:shd w:val="pct15" w:color="auto" w:fill="FFFFFF"/>
+        </w:rPr>
+        <w:t>十力威德难赞说</w:t>
+      </w:r>
+      <w:r>
+        <w:rPr>
+          <w:rFonts w:ascii="楷体" w:eastAsia="楷体" w:hAnsi="楷体" w:hint="eastAsia"/>
+          <w:sz w:val="24"/>
+          <w:szCs w:val="24"/>
+          <w:shd w:val="pct15" w:color="auto" w:fill="FFFFFF"/>
+        </w:rPr>
+        <w:t>。</w:t>
+      </w:r>
+      <w:r>
+        <w:rPr>
+          <w:rFonts w:ascii="楷体" w:eastAsia="楷体" w:hAnsi="楷体" w:hint="eastAsia"/>
+          <w:sz w:val="24"/>
+          <w:szCs w:val="24"/>
+          <w:shd w:val="pct15" w:color="auto" w:fill="FFFFFF"/>
+        </w:rPr>
+        <w:t>称名一声起一念</w:t>
+      </w:r>
+      <w:r>
+        <w:rPr>
+          <w:rFonts w:ascii="楷体" w:eastAsia="楷体" w:hAnsi="楷体" w:hint="eastAsia"/>
+          <w:sz w:val="24"/>
+          <w:szCs w:val="24"/>
+          <w:shd w:val="pct15" w:color="auto" w:fill="FFFFFF"/>
+        </w:rPr>
+        <w:t>。</w:t>
+      </w:r>
+      <w:r>
+        <w:rPr>
+          <w:rFonts w:ascii="楷体" w:eastAsia="楷体" w:hAnsi="楷体" w:hint="eastAsia"/>
+          <w:sz w:val="24"/>
+          <w:szCs w:val="24"/>
+          <w:shd w:val="pct15" w:color="auto" w:fill="FFFFFF"/>
+        </w:rPr>
+        <w:t>八十亿劫罪皆除</w:t>
+      </w:r>
+      <w:r>
+        <w:rPr>
+          <w:rFonts w:ascii="楷体" w:eastAsia="楷体" w:hAnsi="楷体" w:hint="eastAsia"/>
+          <w:sz w:val="24"/>
+          <w:szCs w:val="24"/>
+          <w:shd w:val="pct15" w:color="auto" w:fill="FFFFFF"/>
+        </w:rPr>
+        <w:t>。</w:t>
+      </w:r>
+    </w:p>
+    <w:p>
+      <w:pPr>
+        <w:ind w:firstLineChars="200" w:firstLine="480"/>
+        <w:rPr>
+          <w:rFonts w:ascii="楷体" w:eastAsia="楷体" w:hAnsi="楷体"/>
+          <w:sz w:val="24"/>
+          <w:szCs w:val="24"/>
+          <w:shd w:val="pct15" w:color="auto" w:fill="FFFFFF"/>
+        </w:rPr>
+      </w:pPr>
+      <w:r>
+        <w:rPr>
+          <w:rFonts w:ascii="楷体" w:eastAsia="楷体" w:hAnsi="楷体" w:hint="eastAsia"/>
+          <w:sz w:val="24"/>
+          <w:szCs w:val="24"/>
+          <w:shd w:val="pct15" w:color="auto" w:fill="FFFFFF"/>
+        </w:rPr>
+        <w:t>以是济拔无有穷</w:t>
+      </w:r>
+      <w:r>
+        <w:rPr>
+          <w:rFonts w:ascii="楷体" w:eastAsia="楷体" w:hAnsi="楷体" w:hint="eastAsia"/>
+          <w:sz w:val="24"/>
+          <w:szCs w:val="24"/>
+          <w:shd w:val="pct15" w:color="auto" w:fill="FFFFFF"/>
+        </w:rPr>
+        <w:t>。</w:t>
+      </w:r>
+      <w:r>
+        <w:rPr>
+          <w:rFonts w:ascii="楷体" w:eastAsia="楷体" w:hAnsi="楷体" w:hint="eastAsia"/>
+          <w:sz w:val="24"/>
+          <w:szCs w:val="24"/>
+          <w:shd w:val="pct15" w:color="auto" w:fill="FFFFFF"/>
+        </w:rPr>
+        <w:t>是以名为无量寿</w:t>
+      </w:r>
+      <w:r>
+        <w:rPr>
+          <w:rFonts w:ascii="楷体" w:eastAsia="楷体" w:hAnsi="楷体" w:hint="eastAsia"/>
+          <w:sz w:val="24"/>
+          <w:szCs w:val="24"/>
+          <w:shd w:val="pct15" w:color="auto" w:fill="FFFFFF"/>
+        </w:rPr>
+        <w:t>。</w:t>
+      </w:r>
+      <w:r>
+        <w:rPr>
+          <w:rFonts w:ascii="楷体" w:eastAsia="楷体" w:hAnsi="楷体" w:hint="eastAsia"/>
+          <w:sz w:val="24"/>
+          <w:szCs w:val="24"/>
+          <w:shd w:val="pct15" w:color="auto" w:fill="FFFFFF"/>
+        </w:rPr>
+        <w:t>昔世尊居耆阇崛</w:t>
+      </w:r>
+      <w:r>
+        <w:rPr>
+          <w:rFonts w:ascii="楷体" w:eastAsia="楷体" w:hAnsi="楷体" w:hint="eastAsia"/>
+          <w:sz w:val="24"/>
+          <w:szCs w:val="24"/>
+          <w:shd w:val="pct15" w:color="auto" w:fill="FFFFFF"/>
+        </w:rPr>
+        <w:t>。</w:t>
+      </w:r>
+      <w:r>
+        <w:rPr>
+          <w:rFonts w:ascii="楷体" w:eastAsia="楷体" w:hAnsi="楷体" w:hint="eastAsia"/>
+          <w:sz w:val="24"/>
+          <w:szCs w:val="24"/>
+          <w:shd w:val="pct15" w:color="auto" w:fill="FFFFFF"/>
+        </w:rPr>
+        <w:t>与大众说妙因缘</w:t>
+      </w:r>
+      <w:r>
+        <w:rPr>
+          <w:rFonts w:ascii="楷体" w:eastAsia="楷体" w:hAnsi="楷体" w:hint="eastAsia"/>
+          <w:sz w:val="24"/>
+          <w:szCs w:val="24"/>
+          <w:shd w:val="pct15" w:color="auto" w:fill="FFFFFF"/>
+        </w:rPr>
+        <w:t>。</w:t>
+      </w:r>
+    </w:p>
+    <w:p>
+      <w:pPr>
+        <w:ind w:firstLineChars="200" w:firstLine="480"/>
+        <w:rPr>
+          <w:rFonts w:ascii="楷体" w:eastAsia="楷体" w:hAnsi="楷体"/>
+          <w:sz w:val="24"/>
+          <w:szCs w:val="24"/>
+          <w:shd w:val="pct15" w:color="auto" w:fill="FFFFFF"/>
+        </w:rPr>
+      </w:pPr>
+      <w:r>
+        <w:rPr>
+          <w:rFonts w:ascii="楷体" w:eastAsia="楷体" w:hAnsi="楷体" w:hint="eastAsia"/>
+          <w:sz w:val="24"/>
+          <w:szCs w:val="24"/>
+          <w:shd w:val="pct15" w:color="auto" w:fill="FFFFFF"/>
+        </w:rPr>
+        <w:t>离忧恼与阎浮提</w:t>
+      </w:r>
+      <w:r>
+        <w:rPr>
+          <w:rFonts w:ascii="楷体" w:eastAsia="楷体" w:hAnsi="楷体" w:hint="eastAsia"/>
+          <w:sz w:val="24"/>
+          <w:szCs w:val="24"/>
+          <w:shd w:val="pct15" w:color="auto" w:fill="FFFFFF"/>
+        </w:rPr>
+        <w:t>。</w:t>
+      </w:r>
+      <w:r>
+        <w:rPr>
+          <w:rFonts w:ascii="楷体" w:eastAsia="楷体" w:hAnsi="楷体" w:hint="eastAsia"/>
+          <w:sz w:val="24"/>
+          <w:szCs w:val="24"/>
+          <w:shd w:val="pct15" w:color="auto" w:fill="FFFFFF"/>
+        </w:rPr>
+        <w:t>超脱一切诸苦趣</w:t>
+      </w:r>
+      <w:r>
+        <w:rPr>
+          <w:rFonts w:ascii="楷体" w:eastAsia="楷体" w:hAnsi="楷体" w:hint="eastAsia"/>
+          <w:sz w:val="24"/>
+          <w:szCs w:val="24"/>
+          <w:shd w:val="pct15" w:color="auto" w:fill="FFFFFF"/>
+        </w:rPr>
+        <w:t>。</w:t>
+      </w:r>
+      <w:r>
+        <w:rPr>
+          <w:rFonts w:ascii="楷体" w:eastAsia="楷体" w:hAnsi="楷体" w:hint="eastAsia"/>
+          <w:sz w:val="24"/>
+          <w:szCs w:val="24"/>
+          <w:shd w:val="pct15" w:color="auto" w:fill="FFFFFF"/>
+        </w:rPr>
+        <w:t>净妙国即极乐界</w:t>
+      </w:r>
+      <w:r>
+        <w:rPr>
+          <w:rFonts w:ascii="楷体" w:eastAsia="楷体" w:hAnsi="楷体" w:hint="eastAsia"/>
+          <w:sz w:val="24"/>
+          <w:szCs w:val="24"/>
+          <w:shd w:val="pct15" w:color="auto" w:fill="FFFFFF"/>
+        </w:rPr>
+        <w:t>。</w:t>
+      </w:r>
+      <w:r>
+        <w:rPr>
+          <w:rFonts w:ascii="楷体" w:eastAsia="楷体" w:hAnsi="楷体" w:hint="eastAsia"/>
+          <w:sz w:val="24"/>
+          <w:szCs w:val="24"/>
+          <w:shd w:val="pct15" w:color="auto" w:fill="FFFFFF"/>
+        </w:rPr>
+        <w:t>修三福发菩提心</w:t>
+      </w:r>
+      <w:r>
+        <w:rPr>
+          <w:rFonts w:ascii="楷体" w:eastAsia="楷体" w:hAnsi="楷体" w:hint="eastAsia"/>
+          <w:sz w:val="24"/>
+          <w:szCs w:val="24"/>
+          <w:shd w:val="pct15" w:color="auto" w:fill="FFFFFF"/>
+        </w:rPr>
+        <w:t>。</w:t>
+      </w:r>
+    </w:p>
+    <w:p>
+      <w:pPr>
+        <w:ind w:firstLineChars="200" w:firstLine="480"/>
+        <w:rPr>
+          <w:rFonts w:ascii="楷体" w:eastAsia="楷体" w:hAnsi="楷体"/>
+          <w:sz w:val="24"/>
+          <w:szCs w:val="24"/>
+          <w:shd w:val="pct15" w:color="auto" w:fill="FFFFFF"/>
+        </w:rPr>
+      </w:pPr>
+      <w:r>
+        <w:rPr>
+          <w:rFonts w:ascii="楷体" w:eastAsia="楷体" w:hAnsi="楷体" w:hint="eastAsia"/>
+          <w:sz w:val="24"/>
+          <w:szCs w:val="24"/>
+          <w:shd w:val="pct15" w:color="auto" w:fill="FFFFFF"/>
+        </w:rPr>
+        <w:t>作是念者住坚专</w:t>
+      </w:r>
+      <w:r>
+        <w:rPr>
+          <w:rFonts w:ascii="楷体" w:eastAsia="楷体" w:hAnsi="楷体" w:hint="eastAsia"/>
+          <w:sz w:val="24"/>
+          <w:szCs w:val="24"/>
+          <w:shd w:val="pct15" w:color="auto" w:fill="FFFFFF"/>
+        </w:rPr>
+        <w:t>。</w:t>
+      </w:r>
+      <w:r>
+        <w:rPr>
+          <w:rFonts w:ascii="楷体" w:eastAsia="楷体" w:hAnsi="楷体" w:hint="eastAsia"/>
+          <w:sz w:val="24"/>
+          <w:szCs w:val="24"/>
+          <w:shd w:val="pct15" w:color="auto" w:fill="FFFFFF"/>
+        </w:rPr>
+        <w:t>故说无量寿佛观</w:t>
+      </w:r>
+      <w:r>
+        <w:rPr>
+          <w:rFonts w:ascii="楷体" w:eastAsia="楷体" w:hAnsi="楷体" w:hint="eastAsia"/>
+          <w:sz w:val="24"/>
+          <w:szCs w:val="24"/>
+          <w:shd w:val="pct15" w:color="auto" w:fill="FFFFFF"/>
+        </w:rPr>
+        <w:t>。</w:t>
+      </w:r>
+      <w:r>
+        <w:rPr>
+          <w:rFonts w:ascii="楷体" w:eastAsia="楷体" w:hAnsi="楷体" w:hint="eastAsia"/>
+          <w:sz w:val="24"/>
+          <w:szCs w:val="24"/>
+          <w:shd w:val="pct15" w:color="auto" w:fill="FFFFFF"/>
+        </w:rPr>
+        <w:t>如是功德不可说</w:t>
+      </w:r>
+      <w:r>
+        <w:rPr>
+          <w:rFonts w:ascii="楷体" w:eastAsia="楷体" w:hAnsi="楷体" w:hint="eastAsia"/>
+          <w:sz w:val="24"/>
+          <w:szCs w:val="24"/>
+          <w:shd w:val="pct15" w:color="auto" w:fill="FFFFFF"/>
+        </w:rPr>
+        <w:t>。</w:t>
+      </w:r>
+      <w:r>
+        <w:rPr>
+          <w:rFonts w:ascii="楷体" w:eastAsia="楷体" w:hAnsi="楷体" w:hint="eastAsia"/>
+          <w:sz w:val="24"/>
+          <w:szCs w:val="24"/>
+          <w:shd w:val="pct15" w:color="auto" w:fill="FFFFFF"/>
+        </w:rPr>
+        <w:t>不可说者妙光明</w:t>
+      </w:r>
+      <w:r>
+        <w:rPr>
+          <w:rFonts w:ascii="楷体" w:eastAsia="楷体" w:hAnsi="楷体" w:hint="eastAsia"/>
+          <w:sz w:val="24"/>
+          <w:szCs w:val="24"/>
+          <w:shd w:val="pct15" w:color="auto" w:fill="FFFFFF"/>
+        </w:rPr>
+        <w:t>。</w:t>
+      </w:r>
+    </w:p>
+    <w:p>
+      <w:pPr>
+        <w:ind w:firstLineChars="200" w:firstLine="480"/>
+        <w:rPr>
+          <w:rFonts w:ascii="楷体" w:eastAsia="楷体" w:hAnsi="楷体"/>
+          <w:sz w:val="24"/>
+          <w:szCs w:val="24"/>
+          <w:shd w:val="pct15" w:color="auto" w:fill="FFFFFF"/>
+        </w:rPr>
+      </w:pPr>
+      <w:r>
+        <w:rPr>
+          <w:rFonts w:ascii="楷体" w:eastAsia="楷体" w:hAnsi="楷体" w:hint="eastAsia"/>
+          <w:sz w:val="24"/>
+          <w:szCs w:val="24"/>
+          <w:shd w:val="pct15" w:color="auto" w:fill="FFFFFF"/>
+        </w:rPr>
+        <w:t>无量清净平等施</w:t>
+      </w:r>
+      <w:r>
+        <w:rPr>
+          <w:rFonts w:ascii="楷体" w:eastAsia="楷体" w:hAnsi="楷体" w:hint="eastAsia"/>
+          <w:sz w:val="24"/>
+          <w:szCs w:val="24"/>
+          <w:shd w:val="pct15" w:color="auto" w:fill="FFFFFF"/>
+        </w:rPr>
+        <w:t>。</w:t>
+      </w:r>
+      <w:r>
+        <w:rPr>
+          <w:rFonts w:ascii="楷体" w:eastAsia="楷体" w:hAnsi="楷体" w:hint="eastAsia"/>
+          <w:sz w:val="24"/>
+          <w:szCs w:val="24"/>
+          <w:shd w:val="pct15" w:color="auto" w:fill="FFFFFF"/>
+        </w:rPr>
+        <w:t>五浊众生咸作佛</w:t>
+      </w:r>
+      <w:r>
+        <w:rPr>
+          <w:rFonts w:ascii="楷体" w:eastAsia="楷体" w:hAnsi="楷体" w:hint="eastAsia"/>
+          <w:sz w:val="24"/>
+          <w:szCs w:val="24"/>
+          <w:shd w:val="pct15" w:color="auto" w:fill="FFFFFF"/>
+        </w:rPr>
+        <w:t>。</w:t>
+      </w:r>
+      <w:r>
+        <w:rPr>
+          <w:rFonts w:ascii="楷体" w:eastAsia="楷体" w:hAnsi="楷体" w:hint="eastAsia"/>
+          <w:sz w:val="24"/>
+          <w:szCs w:val="24"/>
+          <w:shd w:val="pct15" w:color="auto" w:fill="FFFFFF"/>
+        </w:rPr>
+        <w:t>断彼一切颠倒想</w:t>
+      </w:r>
+      <w:r>
+        <w:rPr>
+          <w:rFonts w:ascii="楷体" w:eastAsia="楷体" w:hAnsi="楷体" w:hint="eastAsia"/>
+          <w:sz w:val="24"/>
+          <w:szCs w:val="24"/>
+          <w:shd w:val="pct15" w:color="auto" w:fill="FFFFFF"/>
+        </w:rPr>
+        <w:t>。</w:t>
+      </w:r>
+      <w:r>
+        <w:rPr>
+          <w:rFonts w:ascii="楷体" w:eastAsia="楷体" w:hAnsi="楷体" w:hint="eastAsia"/>
+          <w:sz w:val="24"/>
+          <w:szCs w:val="24"/>
+          <w:shd w:val="pct15" w:color="auto" w:fill="FFFFFF"/>
+        </w:rPr>
+        <w:t>犹如以水投海中</w:t>
+      </w:r>
+      <w:r>
+        <w:rPr>
+          <w:rFonts w:ascii="楷体" w:eastAsia="楷体" w:hAnsi="楷体" w:hint="eastAsia"/>
+          <w:sz w:val="24"/>
+          <w:szCs w:val="24"/>
+          <w:shd w:val="pct15" w:color="auto" w:fill="FFFFFF"/>
+        </w:rPr>
+        <w:t>。</w:t>
+      </w:r>
+    </w:p>
+    <w:p>
+      <w:pPr>
+        <w:ind w:firstLineChars="200" w:firstLine="480"/>
+        <w:rPr>
+          <w:rFonts w:ascii="楷体" w:eastAsia="楷体" w:hAnsi="楷体" w:hint="eastAsia"/>
+          <w:sz w:val="24"/>
+          <w:szCs w:val="24"/>
+          <w:shd w:val="pct15" w:color="auto" w:fill="FFFFFF"/>
+        </w:rPr>
+      </w:pPr>
+      <w:r>
+        <w:rPr>
+          <w:rFonts w:ascii="楷体" w:eastAsia="楷体" w:hAnsi="楷体" w:hint="eastAsia"/>
+          <w:sz w:val="24"/>
+          <w:szCs w:val="24"/>
+          <w:shd w:val="pct15" w:color="auto" w:fill="FFFFFF"/>
+        </w:rPr>
+        <w:t>湿性混合无不同</w:t>
+      </w:r>
+      <w:r>
+        <w:rPr>
+          <w:rFonts w:ascii="楷体" w:eastAsia="楷体" w:hAnsi="楷体" w:hint="eastAsia"/>
+          <w:sz w:val="24"/>
+          <w:szCs w:val="24"/>
+          <w:shd w:val="pct15" w:color="auto" w:fill="FFFFFF"/>
+        </w:rPr>
+        <w:t>。</w:t>
+      </w:r>
+      <w:r>
+        <w:rPr>
+          <w:rFonts w:ascii="楷体" w:eastAsia="楷体" w:hAnsi="楷体" w:hint="eastAsia"/>
+          <w:sz w:val="24"/>
+          <w:szCs w:val="24"/>
+          <w:shd w:val="pct15" w:color="auto" w:fill="FFFFFF"/>
+        </w:rPr>
+        <w:t>虽有圣智难分别</w:t>
+      </w:r>
+      <w:r>
+        <w:rPr>
+          <w:rFonts w:ascii="楷体" w:eastAsia="楷体" w:hAnsi="楷体" w:hint="eastAsia"/>
+          <w:sz w:val="24"/>
+          <w:szCs w:val="24"/>
+          <w:shd w:val="pct15" w:color="auto" w:fill="FFFFFF"/>
+        </w:rPr>
+        <w:t>。</w:t>
+      </w:r>
+      <w:r>
+        <w:rPr>
+          <w:rFonts w:ascii="楷体" w:eastAsia="楷体" w:hAnsi="楷体" w:hint="eastAsia"/>
+          <w:sz w:val="24"/>
+          <w:szCs w:val="24"/>
+          <w:shd w:val="pct15" w:color="auto" w:fill="FFFFFF"/>
+        </w:rPr>
+        <w:t>人人皆为无量寿</w:t>
+      </w:r>
+      <w:r>
+        <w:rPr>
+          <w:rFonts w:ascii="楷体" w:eastAsia="楷体" w:hAnsi="楷体" w:hint="eastAsia"/>
+          <w:sz w:val="24"/>
+          <w:szCs w:val="24"/>
+          <w:shd w:val="pct15" w:color="auto" w:fill="FFFFFF"/>
+        </w:rPr>
+        <w:t>。</w:t>
+      </w:r>
+      <w:r>
+        <w:rPr>
+          <w:rFonts w:ascii="楷体" w:eastAsia="楷体" w:hAnsi="楷体" w:hint="eastAsia"/>
+          <w:sz w:val="24"/>
+          <w:szCs w:val="24"/>
+          <w:shd w:val="pct15" w:color="auto" w:fill="FFFFFF"/>
+        </w:rPr>
+        <w:t>稽首瞻礼即西方</w:t>
+      </w:r>
+      <w:r>
+        <w:rPr>
+          <w:rFonts w:ascii="楷体" w:eastAsia="楷体" w:hAnsi="楷体" w:hint="eastAsia"/>
+          <w:sz w:val="24"/>
+          <w:szCs w:val="24"/>
+          <w:shd w:val="pct15" w:color="auto" w:fill="FFFFFF"/>
+        </w:rPr>
+        <w:t>。</w:t>
+      </w:r>
       <w:bookmarkStart w:id="0" w:name="_GoBack"/>
       <w:bookmarkEnd w:id="0"/>
-      <w:r>
-        <w:rPr>
-          <w:rFonts w:ascii="楷体" w:eastAsia="楷体" w:hAnsi="楷体" w:hint="eastAsia"/>
-          <w:sz w:val="24"/>
-          <w:szCs w:val="24"/>
-          <w:shd w:val="pct15" w:color="auto" w:fill="FFFFFF"/>
-        </w:rPr>
-        <w:t>礼佛而退。</w:t>
-      </w:r>
-    </w:p>
-    <w:p>
-      <w:pPr>
-        <w:ind w:firstLineChars="400" w:firstLine="960"/>
-        <w:rPr>
-          <w:rFonts w:ascii="楷体" w:eastAsia="楷体" w:hAnsi="楷体"/>
-          <w:sz w:val="24"/>
-          <w:szCs w:val="24"/>
-          <w:shd w:val="pct15" w:color="auto" w:fill="FFFFFF"/>
-        </w:rPr>
-      </w:pPr>
-    </w:p>
-    <w:p>
-      <w:pPr>
-        <w:ind w:firstLineChars="400" w:firstLine="960"/>
-        <w:rPr>
-          <w:rFonts w:ascii="楷体" w:eastAsia="楷体" w:hAnsi="楷体"/>
-          <w:sz w:val="24"/>
-          <w:szCs w:val="24"/>
-          <w:shd w:val="pct15" w:color="auto" w:fill="FFFFFF"/>
-        </w:rPr>
-      </w:pPr>
-      <w:r>
-        <w:rPr>
-          <w:rFonts w:ascii="楷体" w:eastAsia="楷体" w:hAnsi="楷体" w:hint="eastAsia"/>
-          <w:sz w:val="24"/>
-          <w:szCs w:val="24"/>
-          <w:shd w:val="pct15" w:color="auto" w:fill="FFFFFF"/>
-        </w:rPr>
-        <w:t>御制无量寿佛赞</w:t>
-      </w:r>
-    </w:p>
-    <w:p>
-      <w:pPr>
-        <w:ind w:firstLineChars="200" w:firstLine="480"/>
-        <w:rPr>
-          <w:rFonts w:ascii="楷体" w:eastAsia="楷体" w:hAnsi="楷体"/>
-          <w:sz w:val="24"/>
-          <w:szCs w:val="24"/>
-          <w:shd w:val="pct15" w:color="auto" w:fill="FFFFFF"/>
-        </w:rPr>
-      </w:pPr>
-      <w:r>
-        <w:rPr>
-          <w:rFonts w:ascii="楷体" w:eastAsia="楷体" w:hAnsi="楷体" w:hint="eastAsia"/>
-          <w:sz w:val="24"/>
-          <w:szCs w:val="24"/>
-          <w:shd w:val="pct15" w:color="auto" w:fill="FFFFFF"/>
-        </w:rPr>
-        <w:t>西方极乐世界尊。</w:t>
-      </w:r>
-      <w:r>
-        <w:rPr>
-          <w:rFonts w:ascii="楷体" w:eastAsia="楷体" w:hAnsi="楷体" w:hint="eastAsia"/>
-          <w:sz w:val="24"/>
-          <w:szCs w:val="24"/>
-          <w:shd w:val="pct15" w:color="auto" w:fill="FFFFFF"/>
-        </w:rPr>
-        <w:t>无量寿佛世希有</w:t>
-      </w:r>
-      <w:r>
-        <w:rPr>
-          <w:rFonts w:ascii="楷体" w:eastAsia="楷体" w:hAnsi="楷体" w:hint="eastAsia"/>
-          <w:sz w:val="24"/>
-          <w:szCs w:val="24"/>
-          <w:shd w:val="pct15" w:color="auto" w:fill="FFFFFF"/>
-        </w:rPr>
-        <w:t>。</w:t>
-      </w:r>
-      <w:r>
-        <w:rPr>
-          <w:rFonts w:ascii="楷体" w:eastAsia="楷体" w:hAnsi="楷体" w:hint="eastAsia"/>
-          <w:sz w:val="24"/>
-          <w:szCs w:val="24"/>
-          <w:shd w:val="pct15" w:color="auto" w:fill="FFFFFF"/>
-        </w:rPr>
-        <w:t>能灭无始亿劫业</w:t>
-      </w:r>
-      <w:r>
-        <w:rPr>
-          <w:rFonts w:ascii="楷体" w:eastAsia="楷体" w:hAnsi="楷体" w:hint="eastAsia"/>
-          <w:sz w:val="24"/>
-          <w:szCs w:val="24"/>
-          <w:shd w:val="pct15" w:color="auto" w:fill="FFFFFF"/>
-        </w:rPr>
-        <w:t>。</w:t>
-      </w:r>
-      <w:r>
-        <w:rPr>
-          <w:rFonts w:ascii="楷体" w:eastAsia="楷体" w:hAnsi="楷体" w:hint="eastAsia"/>
-          <w:sz w:val="24"/>
-          <w:szCs w:val="24"/>
-          <w:shd w:val="pct15" w:color="auto" w:fill="FFFFFF"/>
-        </w:rPr>
-        <w:t>令彼苦恼悉消除</w:t>
-      </w:r>
-      <w:r>
-        <w:rPr>
-          <w:rFonts w:ascii="楷体" w:eastAsia="楷体" w:hAnsi="楷体" w:hint="eastAsia"/>
-          <w:sz w:val="24"/>
-          <w:szCs w:val="24"/>
-          <w:shd w:val="pct15" w:color="auto" w:fill="FFFFFF"/>
-        </w:rPr>
-        <w:t>。</w:t>
-      </w:r>
-    </w:p>
-    <w:p>
-      <w:pPr>
-        <w:ind w:firstLineChars="200" w:firstLine="480"/>
-        <w:rPr>
-          <w:rFonts w:ascii="楷体" w:eastAsia="楷体" w:hAnsi="楷体"/>
-          <w:sz w:val="24"/>
-          <w:szCs w:val="24"/>
-          <w:shd w:val="pct15" w:color="auto" w:fill="FFFFFF"/>
-        </w:rPr>
-      </w:pPr>
-      <w:r>
-        <w:rPr>
-          <w:rFonts w:ascii="楷体" w:eastAsia="楷体" w:hAnsi="楷体" w:hint="eastAsia"/>
-          <w:sz w:val="24"/>
-          <w:szCs w:val="24"/>
-          <w:shd w:val="pct15" w:color="auto" w:fill="FFFFFF"/>
-        </w:rPr>
-        <w:t>若人能以微妙心。</w:t>
-      </w:r>
-      <w:r>
-        <w:rPr>
-          <w:rFonts w:ascii="楷体" w:eastAsia="楷体" w:hAnsi="楷体" w:hint="eastAsia"/>
-          <w:sz w:val="24"/>
-          <w:szCs w:val="24"/>
-          <w:shd w:val="pct15" w:color="auto" w:fill="FFFFFF"/>
-        </w:rPr>
-        <w:t>尝以极乐为观想</w:t>
-      </w:r>
-      <w:r>
-        <w:rPr>
-          <w:rFonts w:ascii="楷体" w:eastAsia="楷体" w:hAnsi="楷体" w:hint="eastAsia"/>
-          <w:sz w:val="24"/>
-          <w:szCs w:val="24"/>
-          <w:shd w:val="pct15" w:color="auto" w:fill="FFFFFF"/>
-        </w:rPr>
-        <w:t>。广与众生分别说。</w:t>
-      </w:r>
-      <w:r>
-        <w:rPr>
-          <w:rFonts w:ascii="楷体" w:eastAsia="楷体" w:hAnsi="楷体" w:hint="eastAsia"/>
-          <w:sz w:val="24"/>
-          <w:szCs w:val="24"/>
-          <w:shd w:val="pct15" w:color="auto" w:fill="FFFFFF"/>
-        </w:rPr>
-        <w:t>举目即见阿弥陀</w:t>
-      </w:r>
-      <w:r>
-        <w:rPr>
-          <w:rFonts w:ascii="楷体" w:eastAsia="楷体" w:hAnsi="楷体" w:hint="eastAsia"/>
-          <w:sz w:val="24"/>
-          <w:szCs w:val="24"/>
-          <w:shd w:val="pct15" w:color="auto" w:fill="FFFFFF"/>
-        </w:rPr>
-        <w:t>。</w:t>
-      </w:r>
-    </w:p>
-    <w:p>
-      <w:pPr>
-        <w:ind w:firstLineChars="200" w:firstLine="480"/>
-        <w:rPr>
-          <w:rFonts w:ascii="楷体" w:eastAsia="楷体" w:hAnsi="楷体"/>
-          <w:sz w:val="24"/>
-          <w:szCs w:val="24"/>
-          <w:shd w:val="pct15" w:color="auto" w:fill="FFFFFF"/>
-        </w:rPr>
-      </w:pPr>
-      <w:r>
-        <w:rPr>
-          <w:rFonts w:ascii="楷体" w:eastAsia="楷体" w:hAnsi="楷体" w:hint="eastAsia"/>
-          <w:sz w:val="24"/>
-          <w:szCs w:val="24"/>
-          <w:shd w:val="pct15" w:color="auto" w:fill="FFFFFF"/>
-        </w:rPr>
-        <w:t>佛身色相显光明。</w:t>
-      </w:r>
-      <w:r>
-        <w:rPr>
-          <w:rFonts w:ascii="楷体" w:eastAsia="楷体" w:hAnsi="楷体" w:hint="eastAsia"/>
-          <w:sz w:val="24"/>
-          <w:szCs w:val="24"/>
-          <w:shd w:val="pct15" w:color="auto" w:fill="FFFFFF"/>
-        </w:rPr>
-        <w:t>阎浮檀金无与等</w:t>
-      </w:r>
-      <w:r>
-        <w:rPr>
-          <w:rFonts w:ascii="楷体" w:eastAsia="楷体" w:hAnsi="楷体" w:hint="eastAsia"/>
-          <w:sz w:val="24"/>
-          <w:szCs w:val="24"/>
-          <w:shd w:val="pct15" w:color="auto" w:fill="FFFFFF"/>
-        </w:rPr>
-        <w:t>。</w:t>
-      </w:r>
-      <w:r>
-        <w:rPr>
-          <w:rFonts w:ascii="楷体" w:eastAsia="楷体" w:hAnsi="楷体" w:hint="eastAsia"/>
-          <w:sz w:val="24"/>
-          <w:szCs w:val="24"/>
-          <w:shd w:val="pct15" w:color="auto" w:fill="FFFFFF"/>
-        </w:rPr>
-        <w:t>其高无比由旬数</w:t>
-      </w:r>
-      <w:r>
-        <w:rPr>
-          <w:rFonts w:ascii="楷体" w:eastAsia="楷体" w:hAnsi="楷体" w:hint="eastAsia"/>
-          <w:sz w:val="24"/>
-          <w:szCs w:val="24"/>
-          <w:shd w:val="pct15" w:color="auto" w:fill="FFFFFF"/>
-        </w:rPr>
-        <w:t>。</w:t>
-      </w:r>
-      <w:r>
-        <w:rPr>
-          <w:rFonts w:ascii="楷体" w:eastAsia="楷体" w:hAnsi="楷体" w:hint="eastAsia"/>
-          <w:sz w:val="24"/>
-          <w:szCs w:val="24"/>
-          <w:shd w:val="pct15" w:color="auto" w:fill="FFFFFF"/>
-        </w:rPr>
-        <w:t>六十万亿那由他</w:t>
-      </w:r>
-      <w:r>
-        <w:rPr>
-          <w:rFonts w:ascii="楷体" w:eastAsia="楷体" w:hAnsi="楷体" w:hint="eastAsia"/>
-          <w:sz w:val="24"/>
-          <w:szCs w:val="24"/>
-          <w:shd w:val="pct15" w:color="auto" w:fill="FFFFFF"/>
-        </w:rPr>
-        <w:t>。</w:t>
-      </w:r>
-    </w:p>
-    <w:p>
-      <w:pPr>
-        <w:ind w:firstLineChars="200" w:firstLine="480"/>
-        <w:rPr>
-          <w:rFonts w:ascii="楷体" w:eastAsia="楷体" w:hAnsi="楷体"/>
-          <w:sz w:val="24"/>
-          <w:szCs w:val="24"/>
-          <w:shd w:val="pct15" w:color="auto" w:fill="FFFFFF"/>
-        </w:rPr>
-      </w:pPr>
-      <w:r>
-        <w:rPr>
-          <w:rFonts w:ascii="楷体" w:eastAsia="楷体" w:hAnsi="楷体" w:hint="eastAsia"/>
-          <w:sz w:val="24"/>
-          <w:szCs w:val="24"/>
-          <w:shd w:val="pct15" w:color="auto" w:fill="FFFFFF"/>
-        </w:rPr>
-        <w:t>眉间白毫五须弥</w:t>
-      </w:r>
-      <w:r>
-        <w:rPr>
-          <w:rFonts w:ascii="楷体" w:eastAsia="楷体" w:hAnsi="楷体" w:hint="eastAsia"/>
-          <w:sz w:val="24"/>
-          <w:szCs w:val="24"/>
-          <w:shd w:val="pct15" w:color="auto" w:fill="FFFFFF"/>
-        </w:rPr>
-        <w:t>。</w:t>
-      </w:r>
-      <w:r>
-        <w:rPr>
-          <w:rFonts w:ascii="楷体" w:eastAsia="楷体" w:hAnsi="楷体" w:hint="eastAsia"/>
-          <w:sz w:val="24"/>
-          <w:szCs w:val="24"/>
-          <w:shd w:val="pct15" w:color="auto" w:fill="FFFFFF"/>
-        </w:rPr>
-        <w:t>绀眼弘澄四大海</w:t>
-      </w:r>
-      <w:r>
-        <w:rPr>
-          <w:rFonts w:ascii="楷体" w:eastAsia="楷体" w:hAnsi="楷体" w:hint="eastAsia"/>
-          <w:sz w:val="24"/>
-          <w:szCs w:val="24"/>
-          <w:shd w:val="pct15" w:color="auto" w:fill="FFFFFF"/>
-        </w:rPr>
-        <w:t>。</w:t>
-      </w:r>
-      <w:r>
-        <w:rPr>
-          <w:rFonts w:ascii="楷体" w:eastAsia="楷体" w:hAnsi="楷体" w:hint="eastAsia"/>
-          <w:sz w:val="24"/>
-          <w:szCs w:val="24"/>
-          <w:shd w:val="pct15" w:color="auto" w:fill="FFFFFF"/>
-        </w:rPr>
-        <w:t>光明演出诸毛孔</w:t>
-      </w:r>
-      <w:r>
-        <w:rPr>
-          <w:rFonts w:ascii="楷体" w:eastAsia="楷体" w:hAnsi="楷体" w:hint="eastAsia"/>
-          <w:sz w:val="24"/>
-          <w:szCs w:val="24"/>
-          <w:shd w:val="pct15" w:color="auto" w:fill="FFFFFF"/>
-        </w:rPr>
-        <w:t>。</w:t>
-      </w:r>
-      <w:r>
-        <w:rPr>
-          <w:rFonts w:ascii="楷体" w:eastAsia="楷体" w:hAnsi="楷体" w:hint="eastAsia"/>
-          <w:sz w:val="24"/>
-          <w:szCs w:val="24"/>
-          <w:shd w:val="pct15" w:color="auto" w:fill="FFFFFF"/>
-        </w:rPr>
-        <w:t>一孔遍含诸大千</w:t>
-      </w:r>
-      <w:r>
-        <w:rPr>
-          <w:rFonts w:ascii="楷体" w:eastAsia="楷体" w:hAnsi="楷体" w:hint="eastAsia"/>
-          <w:sz w:val="24"/>
-          <w:szCs w:val="24"/>
-          <w:shd w:val="pct15" w:color="auto" w:fill="FFFFFF"/>
-        </w:rPr>
-        <w:t>。</w:t>
-      </w:r>
-    </w:p>
-    <w:p>
-      <w:pPr>
-        <w:ind w:firstLineChars="200" w:firstLine="480"/>
-        <w:rPr>
-          <w:rFonts w:ascii="楷体" w:eastAsia="楷体" w:hAnsi="楷体"/>
-          <w:sz w:val="24"/>
-          <w:szCs w:val="24"/>
-          <w:shd w:val="pct15" w:color="auto" w:fill="FFFFFF"/>
-        </w:rPr>
-      </w:pPr>
-      <w:r>
-        <w:rPr>
-          <w:rFonts w:ascii="楷体" w:eastAsia="楷体" w:hAnsi="楷体" w:hint="eastAsia"/>
-          <w:sz w:val="24"/>
-          <w:szCs w:val="24"/>
-          <w:shd w:val="pct15" w:color="auto" w:fill="FFFFFF"/>
-        </w:rPr>
-        <w:t>一界中有一河沙</w:t>
-      </w:r>
-      <w:r>
-        <w:rPr>
-          <w:rFonts w:ascii="楷体" w:eastAsia="楷体" w:hAnsi="楷体" w:hint="eastAsia"/>
-          <w:sz w:val="24"/>
-          <w:szCs w:val="24"/>
-          <w:shd w:val="pct15" w:color="auto" w:fill="FFFFFF"/>
-        </w:rPr>
-        <w:t>。</w:t>
-      </w:r>
-      <w:r>
-        <w:rPr>
-          <w:rFonts w:ascii="楷体" w:eastAsia="楷体" w:hAnsi="楷体" w:hint="eastAsia"/>
-          <w:sz w:val="24"/>
-          <w:szCs w:val="24"/>
-          <w:shd w:val="pct15" w:color="auto" w:fill="FFFFFF"/>
-        </w:rPr>
-        <w:t>沙有八万四千相</w:t>
-      </w:r>
-      <w:r>
-        <w:rPr>
-          <w:rFonts w:ascii="楷体" w:eastAsia="楷体" w:hAnsi="楷体" w:hint="eastAsia"/>
-          <w:sz w:val="24"/>
-          <w:szCs w:val="24"/>
-          <w:shd w:val="pct15" w:color="auto" w:fill="FFFFFF"/>
-        </w:rPr>
-        <w:t>。</w:t>
-      </w:r>
-      <w:r>
-        <w:rPr>
-          <w:rFonts w:ascii="楷体" w:eastAsia="楷体" w:hAnsi="楷体" w:hint="eastAsia"/>
-          <w:sz w:val="24"/>
-          <w:szCs w:val="24"/>
-          <w:shd w:val="pct15" w:color="auto" w:fill="FFFFFF"/>
-        </w:rPr>
-        <w:t>一一相中复如是</w:t>
-      </w:r>
-      <w:r>
-        <w:rPr>
-          <w:rFonts w:ascii="楷体" w:eastAsia="楷体" w:hAnsi="楷体" w:hint="eastAsia"/>
-          <w:sz w:val="24"/>
-          <w:szCs w:val="24"/>
-          <w:shd w:val="pct15" w:color="auto" w:fill="FFFFFF"/>
-        </w:rPr>
-        <w:t>。</w:t>
-      </w:r>
-      <w:r>
-        <w:rPr>
-          <w:rFonts w:ascii="楷体" w:eastAsia="楷体" w:hAnsi="楷体" w:hint="eastAsia"/>
-          <w:sz w:val="24"/>
-          <w:szCs w:val="24"/>
-          <w:shd w:val="pct15" w:color="auto" w:fill="FFFFFF"/>
-        </w:rPr>
-        <w:t>作者观者随现前</w:t>
-      </w:r>
-      <w:r>
-        <w:rPr>
-          <w:rFonts w:ascii="楷体" w:eastAsia="楷体" w:hAnsi="楷体" w:hint="eastAsia"/>
-          <w:sz w:val="24"/>
-          <w:szCs w:val="24"/>
-          <w:shd w:val="pct15" w:color="auto" w:fill="FFFFFF"/>
-        </w:rPr>
-        <w:t>。</w:t>
-      </w:r>
-    </w:p>
-    <w:p>
-      <w:pPr>
-        <w:ind w:firstLineChars="200" w:firstLine="480"/>
-        <w:rPr>
-          <w:rFonts w:ascii="楷体" w:eastAsia="楷体" w:hAnsi="楷体"/>
-          <w:sz w:val="24"/>
-          <w:szCs w:val="24"/>
-          <w:shd w:val="pct15" w:color="auto" w:fill="FFFFFF"/>
-        </w:rPr>
-      </w:pPr>
-      <w:r>
-        <w:rPr>
-          <w:rFonts w:ascii="楷体" w:eastAsia="楷体" w:hAnsi="楷体" w:hint="eastAsia"/>
-          <w:sz w:val="24"/>
-          <w:szCs w:val="24"/>
-          <w:shd w:val="pct15" w:color="auto" w:fill="FFFFFF"/>
-        </w:rPr>
-        <w:t>以观佛身见佛心</w:t>
-      </w:r>
-      <w:r>
-        <w:rPr>
-          <w:rFonts w:ascii="楷体" w:eastAsia="楷体" w:hAnsi="楷体" w:hint="eastAsia"/>
-          <w:sz w:val="24"/>
-          <w:szCs w:val="24"/>
-          <w:shd w:val="pct15" w:color="auto" w:fill="FFFFFF"/>
-        </w:rPr>
-        <w:t>。</w:t>
-      </w:r>
-      <w:r>
-        <w:rPr>
-          <w:rFonts w:ascii="楷体" w:eastAsia="楷体" w:hAnsi="楷体" w:hint="eastAsia"/>
-          <w:sz w:val="24"/>
-          <w:szCs w:val="24"/>
-          <w:shd w:val="pct15" w:color="auto" w:fill="FFFFFF"/>
-        </w:rPr>
-        <w:t>众生忆想见化佛</w:t>
-      </w:r>
-      <w:r>
-        <w:rPr>
-          <w:rFonts w:ascii="楷体" w:eastAsia="楷体" w:hAnsi="楷体" w:hint="eastAsia"/>
-          <w:sz w:val="24"/>
-          <w:szCs w:val="24"/>
-          <w:shd w:val="pct15" w:color="auto" w:fill="FFFFFF"/>
-        </w:rPr>
-        <w:t>。</w:t>
-      </w:r>
-      <w:r>
-        <w:rPr>
-          <w:rFonts w:ascii="楷体" w:eastAsia="楷体" w:hAnsi="楷体" w:hint="eastAsia"/>
-          <w:sz w:val="24"/>
-          <w:szCs w:val="24"/>
-          <w:shd w:val="pct15" w:color="auto" w:fill="FFFFFF"/>
-        </w:rPr>
-        <w:t>从相入得无生忍</w:t>
-      </w:r>
-      <w:r>
-        <w:rPr>
-          <w:rFonts w:ascii="楷体" w:eastAsia="楷体" w:hAnsi="楷体" w:hint="eastAsia"/>
-          <w:sz w:val="24"/>
-          <w:szCs w:val="24"/>
-          <w:shd w:val="pct15" w:color="auto" w:fill="FFFFFF"/>
-        </w:rPr>
-        <w:t>。</w:t>
-      </w:r>
-      <w:r>
-        <w:rPr>
-          <w:rFonts w:ascii="楷体" w:eastAsia="楷体" w:hAnsi="楷体" w:hint="eastAsia"/>
-          <w:sz w:val="24"/>
-          <w:szCs w:val="24"/>
-          <w:shd w:val="pct15" w:color="auto" w:fill="FFFFFF"/>
-        </w:rPr>
-        <w:t>以三昧受无边慈</w:t>
-      </w:r>
-      <w:r>
-        <w:rPr>
-          <w:rFonts w:ascii="楷体" w:eastAsia="楷体" w:hAnsi="楷体" w:hint="eastAsia"/>
-          <w:sz w:val="24"/>
-          <w:szCs w:val="24"/>
-          <w:shd w:val="pct15" w:color="auto" w:fill="FFFFFF"/>
-        </w:rPr>
-        <w:t>。</w:t>
-      </w:r>
-    </w:p>
-    <w:p>
-      <w:pPr>
-        <w:ind w:firstLineChars="200" w:firstLine="480"/>
-        <w:rPr>
-          <w:rFonts w:ascii="楷体" w:eastAsia="楷体" w:hAnsi="楷体"/>
-          <w:sz w:val="24"/>
-          <w:szCs w:val="24"/>
-          <w:shd w:val="pct15" w:color="auto" w:fill="FFFFFF"/>
-        </w:rPr>
-      </w:pPr>
-      <w:r>
-        <w:rPr>
-          <w:rFonts w:ascii="楷体" w:eastAsia="楷体" w:hAnsi="楷体" w:hint="eastAsia"/>
-          <w:sz w:val="24"/>
-          <w:szCs w:val="24"/>
-          <w:shd w:val="pct15" w:color="auto" w:fill="FFFFFF"/>
-        </w:rPr>
-        <w:t>佛身无量广无边。</w:t>
-      </w:r>
-      <w:r>
-        <w:rPr>
-          <w:rFonts w:ascii="楷体" w:eastAsia="楷体" w:hAnsi="楷体" w:hint="eastAsia"/>
-          <w:sz w:val="24"/>
-          <w:szCs w:val="24"/>
-          <w:shd w:val="pct15" w:color="auto" w:fill="FFFFFF"/>
-        </w:rPr>
-        <w:t>化导以彼宿愿力</w:t>
-      </w:r>
-      <w:r>
-        <w:rPr>
-          <w:rFonts w:ascii="楷体" w:eastAsia="楷体" w:hAnsi="楷体" w:hint="eastAsia"/>
-          <w:sz w:val="24"/>
-          <w:szCs w:val="24"/>
-          <w:shd w:val="pct15" w:color="auto" w:fill="FFFFFF"/>
-        </w:rPr>
-        <w:t>。</w:t>
-      </w:r>
-      <w:r>
-        <w:rPr>
-          <w:rFonts w:ascii="楷体" w:eastAsia="楷体" w:hAnsi="楷体" w:hint="eastAsia"/>
-          <w:sz w:val="24"/>
-          <w:szCs w:val="24"/>
-          <w:shd w:val="pct15" w:color="auto" w:fill="FFFFFF"/>
-        </w:rPr>
-        <w:t>有忆想者得成就</w:t>
-      </w:r>
-      <w:r>
-        <w:rPr>
-          <w:rFonts w:ascii="楷体" w:eastAsia="楷体" w:hAnsi="楷体" w:hint="eastAsia"/>
-          <w:sz w:val="24"/>
-          <w:szCs w:val="24"/>
-          <w:shd w:val="pct15" w:color="auto" w:fill="FFFFFF"/>
-        </w:rPr>
-        <w:t>。</w:t>
-      </w:r>
-      <w:r>
-        <w:rPr>
-          <w:rFonts w:ascii="楷体" w:eastAsia="楷体" w:hAnsi="楷体" w:hint="eastAsia"/>
-          <w:sz w:val="24"/>
-          <w:szCs w:val="24"/>
-          <w:shd w:val="pct15" w:color="auto" w:fill="FFFFFF"/>
-        </w:rPr>
-        <w:t>神通如意满虚空</w:t>
-      </w:r>
-      <w:r>
-        <w:rPr>
-          <w:rFonts w:ascii="楷体" w:eastAsia="楷体" w:hAnsi="楷体" w:hint="eastAsia"/>
-          <w:sz w:val="24"/>
-          <w:szCs w:val="24"/>
-          <w:shd w:val="pct15" w:color="auto" w:fill="FFFFFF"/>
-        </w:rPr>
-        <w:t>。</w:t>
-      </w:r>
-    </w:p>
-    <w:p>
-      <w:pPr>
-        <w:ind w:firstLineChars="200" w:firstLine="480"/>
-        <w:rPr>
-          <w:rFonts w:ascii="楷体" w:eastAsia="楷体" w:hAnsi="楷体"/>
-          <w:sz w:val="24"/>
-          <w:szCs w:val="24"/>
-          <w:shd w:val="pct15" w:color="auto" w:fill="FFFFFF"/>
-        </w:rPr>
-      </w:pPr>
-      <w:r>
-        <w:rPr>
-          <w:rFonts w:ascii="楷体" w:eastAsia="楷体" w:hAnsi="楷体" w:hint="eastAsia"/>
-          <w:sz w:val="24"/>
-          <w:szCs w:val="24"/>
-          <w:shd w:val="pct15" w:color="auto" w:fill="FFFFFF"/>
-        </w:rPr>
-        <w:t>众生三种具三心</w:t>
-      </w:r>
-      <w:r>
-        <w:rPr>
-          <w:rFonts w:ascii="楷体" w:eastAsia="楷体" w:hAnsi="楷体" w:hint="eastAsia"/>
-          <w:sz w:val="24"/>
-          <w:szCs w:val="24"/>
-          <w:shd w:val="pct15" w:color="auto" w:fill="FFFFFF"/>
-        </w:rPr>
-        <w:t>。</w:t>
-      </w:r>
-      <w:r>
-        <w:rPr>
-          <w:rFonts w:ascii="楷体" w:eastAsia="楷体" w:hAnsi="楷体" w:hint="eastAsia"/>
-          <w:sz w:val="24"/>
-          <w:szCs w:val="24"/>
-          <w:shd w:val="pct15" w:color="auto" w:fill="FFFFFF"/>
-        </w:rPr>
-        <w:t>精进勇猛无退转</w:t>
-      </w:r>
-      <w:r>
-        <w:rPr>
-          <w:rFonts w:ascii="楷体" w:eastAsia="楷体" w:hAnsi="楷体" w:hint="eastAsia"/>
-          <w:sz w:val="24"/>
-          <w:szCs w:val="24"/>
-          <w:shd w:val="pct15" w:color="auto" w:fill="FFFFFF"/>
-        </w:rPr>
-        <w:t>。</w:t>
-      </w:r>
-      <w:r>
-        <w:rPr>
-          <w:rFonts w:ascii="楷体" w:eastAsia="楷体" w:hAnsi="楷体" w:hint="eastAsia"/>
-          <w:sz w:val="24"/>
-          <w:szCs w:val="24"/>
-          <w:shd w:val="pct15" w:color="auto" w:fill="FFFFFF"/>
-        </w:rPr>
-        <w:t>即得如来手接引</w:t>
-      </w:r>
-      <w:r>
-        <w:rPr>
-          <w:rFonts w:ascii="楷体" w:eastAsia="楷体" w:hAnsi="楷体" w:hint="eastAsia"/>
-          <w:sz w:val="24"/>
-          <w:szCs w:val="24"/>
-          <w:shd w:val="pct15" w:color="auto" w:fill="FFFFFF"/>
-        </w:rPr>
-        <w:t>。</w:t>
-      </w:r>
-      <w:r>
-        <w:rPr>
-          <w:rFonts w:ascii="楷体" w:eastAsia="楷体" w:hAnsi="楷体" w:hint="eastAsia"/>
-          <w:sz w:val="24"/>
-          <w:szCs w:val="24"/>
-          <w:shd w:val="pct15" w:color="auto" w:fill="FFFFFF"/>
-        </w:rPr>
-        <w:t>七宝宫殿大光明</w:t>
-      </w:r>
-      <w:r>
-        <w:rPr>
-          <w:rFonts w:ascii="楷体" w:eastAsia="楷体" w:hAnsi="楷体" w:hint="eastAsia"/>
-          <w:sz w:val="24"/>
-          <w:szCs w:val="24"/>
-          <w:shd w:val="pct15" w:color="auto" w:fill="FFFFFF"/>
-        </w:rPr>
-        <w:t>。</w:t>
-      </w:r>
-    </w:p>
-    <w:p>
-      <w:pPr>
-        <w:ind w:firstLineChars="200" w:firstLine="480"/>
-        <w:rPr>
-          <w:rFonts w:ascii="楷体" w:eastAsia="楷体" w:hAnsi="楷体"/>
-          <w:sz w:val="24"/>
-          <w:szCs w:val="24"/>
-          <w:shd w:val="pct15" w:color="auto" w:fill="FFFFFF"/>
-        </w:rPr>
-      </w:pPr>
-      <w:r>
-        <w:rPr>
-          <w:rFonts w:ascii="楷体" w:eastAsia="楷体" w:hAnsi="楷体" w:hint="eastAsia"/>
-          <w:sz w:val="24"/>
-          <w:szCs w:val="24"/>
-          <w:shd w:val="pct15" w:color="auto" w:fill="FFFFFF"/>
-        </w:rPr>
-        <w:t>其身踊跃金刚台</w:t>
-      </w:r>
-      <w:r>
-        <w:rPr>
-          <w:rFonts w:ascii="楷体" w:eastAsia="楷体" w:hAnsi="楷体" w:hint="eastAsia"/>
-          <w:sz w:val="24"/>
-          <w:szCs w:val="24"/>
-          <w:shd w:val="pct15" w:color="auto" w:fill="FFFFFF"/>
-        </w:rPr>
-        <w:t>。</w:t>
-      </w:r>
-      <w:r>
-        <w:rPr>
-          <w:rFonts w:ascii="楷体" w:eastAsia="楷体" w:hAnsi="楷体" w:hint="eastAsia"/>
-          <w:sz w:val="24"/>
-          <w:szCs w:val="24"/>
-          <w:shd w:val="pct15" w:color="auto" w:fill="FFFFFF"/>
-        </w:rPr>
-        <w:t>随从佛后弹指顷</w:t>
-      </w:r>
-      <w:r>
-        <w:rPr>
-          <w:rFonts w:ascii="楷体" w:eastAsia="楷体" w:hAnsi="楷体" w:hint="eastAsia"/>
-          <w:sz w:val="24"/>
-          <w:szCs w:val="24"/>
-          <w:shd w:val="pct15" w:color="auto" w:fill="FFFFFF"/>
-        </w:rPr>
-        <w:t>。</w:t>
-      </w:r>
-      <w:r>
-        <w:rPr>
-          <w:rFonts w:ascii="楷体" w:eastAsia="楷体" w:hAnsi="楷体" w:hint="eastAsia"/>
-          <w:sz w:val="24"/>
-          <w:szCs w:val="24"/>
-          <w:shd w:val="pct15" w:color="auto" w:fill="FFFFFF"/>
-        </w:rPr>
-        <w:t>行大乘解第一义</w:t>
-      </w:r>
-      <w:r>
-        <w:rPr>
-          <w:rFonts w:ascii="楷体" w:eastAsia="楷体" w:hAnsi="楷体" w:hint="eastAsia"/>
-          <w:sz w:val="24"/>
-          <w:szCs w:val="24"/>
-          <w:shd w:val="pct15" w:color="auto" w:fill="FFFFFF"/>
-        </w:rPr>
-        <w:t>。</w:t>
-      </w:r>
-      <w:r>
-        <w:rPr>
-          <w:rFonts w:ascii="楷体" w:eastAsia="楷体" w:hAnsi="楷体" w:hint="eastAsia"/>
-          <w:sz w:val="24"/>
-          <w:szCs w:val="24"/>
-          <w:shd w:val="pct15" w:color="auto" w:fill="FFFFFF"/>
-        </w:rPr>
-        <w:t>即生七宝莲池中</w:t>
-      </w:r>
-      <w:r>
-        <w:rPr>
-          <w:rFonts w:ascii="楷体" w:eastAsia="楷体" w:hAnsi="楷体" w:hint="eastAsia"/>
-          <w:sz w:val="24"/>
-          <w:szCs w:val="24"/>
-          <w:shd w:val="pct15" w:color="auto" w:fill="FFFFFF"/>
-        </w:rPr>
-        <w:t>。</w:t>
-      </w:r>
-    </w:p>
-    <w:p>
-      <w:pPr>
-        <w:ind w:firstLineChars="200" w:firstLine="480"/>
-        <w:rPr>
-          <w:rFonts w:ascii="楷体" w:eastAsia="楷体" w:hAnsi="楷体"/>
-          <w:sz w:val="24"/>
-          <w:szCs w:val="24"/>
-          <w:shd w:val="pct15" w:color="auto" w:fill="FFFFFF"/>
-        </w:rPr>
-      </w:pPr>
-      <w:r>
-        <w:rPr>
-          <w:rFonts w:ascii="楷体" w:eastAsia="楷体" w:hAnsi="楷体" w:hint="eastAsia"/>
-          <w:sz w:val="24"/>
-          <w:szCs w:val="24"/>
-          <w:shd w:val="pct15" w:color="auto" w:fill="FFFFFF"/>
-        </w:rPr>
-        <w:t>阿弥陀佛大慈悲</w:t>
-      </w:r>
-      <w:r>
-        <w:rPr>
-          <w:rFonts w:ascii="楷体" w:eastAsia="楷体" w:hAnsi="楷体" w:hint="eastAsia"/>
-          <w:sz w:val="24"/>
-          <w:szCs w:val="24"/>
-          <w:shd w:val="pct15" w:color="auto" w:fill="FFFFFF"/>
-        </w:rPr>
-        <w:t>。</w:t>
-      </w:r>
-      <w:r>
-        <w:rPr>
-          <w:rFonts w:ascii="楷体" w:eastAsia="楷体" w:hAnsi="楷体" w:hint="eastAsia"/>
-          <w:sz w:val="24"/>
-          <w:szCs w:val="24"/>
-          <w:shd w:val="pct15" w:color="auto" w:fill="FFFFFF"/>
-        </w:rPr>
-        <w:t>十力威德难赞说</w:t>
-      </w:r>
-      <w:r>
-        <w:rPr>
-          <w:rFonts w:ascii="楷体" w:eastAsia="楷体" w:hAnsi="楷体" w:hint="eastAsia"/>
-          <w:sz w:val="24"/>
-          <w:szCs w:val="24"/>
-          <w:shd w:val="pct15" w:color="auto" w:fill="FFFFFF"/>
-        </w:rPr>
-        <w:t>。</w:t>
-      </w:r>
-      <w:r>
-        <w:rPr>
-          <w:rFonts w:ascii="楷体" w:eastAsia="楷体" w:hAnsi="楷体" w:hint="eastAsia"/>
-          <w:sz w:val="24"/>
-          <w:szCs w:val="24"/>
-          <w:shd w:val="pct15" w:color="auto" w:fill="FFFFFF"/>
-        </w:rPr>
-        <w:t>称名一声起一念</w:t>
-      </w:r>
-      <w:r>
-        <w:rPr>
-          <w:rFonts w:ascii="楷体" w:eastAsia="楷体" w:hAnsi="楷体" w:hint="eastAsia"/>
-          <w:sz w:val="24"/>
-          <w:szCs w:val="24"/>
-          <w:shd w:val="pct15" w:color="auto" w:fill="FFFFFF"/>
-        </w:rPr>
-        <w:t>。</w:t>
-      </w:r>
-      <w:r>
-        <w:rPr>
-          <w:rFonts w:ascii="楷体" w:eastAsia="楷体" w:hAnsi="楷体" w:hint="eastAsia"/>
-          <w:sz w:val="24"/>
-          <w:szCs w:val="24"/>
-          <w:shd w:val="pct15" w:color="auto" w:fill="FFFFFF"/>
-        </w:rPr>
-        <w:t>八十亿劫罪皆除</w:t>
-      </w:r>
-      <w:r>
-        <w:rPr>
-          <w:rFonts w:ascii="楷体" w:eastAsia="楷体" w:hAnsi="楷体" w:hint="eastAsia"/>
-          <w:sz w:val="24"/>
-          <w:szCs w:val="24"/>
-          <w:shd w:val="pct15" w:color="auto" w:fill="FFFFFF"/>
-        </w:rPr>
-        <w:t>。</w:t>
-      </w:r>
-    </w:p>
-    <w:p>
-      <w:pPr>
-        <w:ind w:firstLineChars="200" w:firstLine="480"/>
-        <w:rPr>
-          <w:rFonts w:ascii="楷体" w:eastAsia="楷体" w:hAnsi="楷体"/>
-          <w:sz w:val="24"/>
-          <w:szCs w:val="24"/>
-          <w:shd w:val="pct15" w:color="auto" w:fill="FFFFFF"/>
-        </w:rPr>
-      </w:pPr>
-      <w:r>
-        <w:rPr>
-          <w:rFonts w:ascii="楷体" w:eastAsia="楷体" w:hAnsi="楷体" w:hint="eastAsia"/>
-          <w:sz w:val="24"/>
-          <w:szCs w:val="24"/>
-          <w:shd w:val="pct15" w:color="auto" w:fill="FFFFFF"/>
-        </w:rPr>
-        <w:t>以是济拔无有穷</w:t>
-      </w:r>
-      <w:r>
-        <w:rPr>
-          <w:rFonts w:ascii="楷体" w:eastAsia="楷体" w:hAnsi="楷体" w:hint="eastAsia"/>
-          <w:sz w:val="24"/>
-          <w:szCs w:val="24"/>
-          <w:shd w:val="pct15" w:color="auto" w:fill="FFFFFF"/>
-        </w:rPr>
-        <w:t>。</w:t>
-      </w:r>
-      <w:r>
-        <w:rPr>
-          <w:rFonts w:ascii="楷体" w:eastAsia="楷体" w:hAnsi="楷体" w:hint="eastAsia"/>
-          <w:sz w:val="24"/>
-          <w:szCs w:val="24"/>
-          <w:shd w:val="pct15" w:color="auto" w:fill="FFFFFF"/>
-        </w:rPr>
-        <w:t>是以名为无量寿</w:t>
-      </w:r>
-      <w:r>
-        <w:rPr>
-          <w:rFonts w:ascii="楷体" w:eastAsia="楷体" w:hAnsi="楷体" w:hint="eastAsia"/>
-          <w:sz w:val="24"/>
-          <w:szCs w:val="24"/>
-          <w:shd w:val="pct15" w:color="auto" w:fill="FFFFFF"/>
-        </w:rPr>
-        <w:t>。</w:t>
-      </w:r>
-      <w:r>
-        <w:rPr>
-          <w:rFonts w:ascii="楷体" w:eastAsia="楷体" w:hAnsi="楷体" w:hint="eastAsia"/>
-          <w:sz w:val="24"/>
-          <w:szCs w:val="24"/>
-          <w:shd w:val="pct15" w:color="auto" w:fill="FFFFFF"/>
-        </w:rPr>
-        <w:t>昔世尊居耆阇崛</w:t>
-      </w:r>
-      <w:r>
-        <w:rPr>
-          <w:rFonts w:ascii="楷体" w:eastAsia="楷体" w:hAnsi="楷体" w:hint="eastAsia"/>
-          <w:sz w:val="24"/>
-          <w:szCs w:val="24"/>
-          <w:shd w:val="pct15" w:color="auto" w:fill="FFFFFF"/>
-        </w:rPr>
-        <w:t>。</w:t>
-      </w:r>
-      <w:r>
-        <w:rPr>
-          <w:rFonts w:ascii="楷体" w:eastAsia="楷体" w:hAnsi="楷体" w:hint="eastAsia"/>
-          <w:sz w:val="24"/>
-          <w:szCs w:val="24"/>
-          <w:shd w:val="pct15" w:color="auto" w:fill="FFFFFF"/>
-        </w:rPr>
-        <w:t>与大众说妙因缘</w:t>
-      </w:r>
-      <w:r>
-        <w:rPr>
-          <w:rFonts w:ascii="楷体" w:eastAsia="楷体" w:hAnsi="楷体" w:hint="eastAsia"/>
-          <w:sz w:val="24"/>
-          <w:szCs w:val="24"/>
-          <w:shd w:val="pct15" w:color="auto" w:fill="FFFFFF"/>
-        </w:rPr>
-        <w:t>。</w:t>
-      </w:r>
-    </w:p>
-    <w:p>
-      <w:pPr>
-        <w:ind w:firstLineChars="200" w:firstLine="480"/>
-        <w:rPr>
-          <w:rFonts w:ascii="楷体" w:eastAsia="楷体" w:hAnsi="楷体"/>
-          <w:sz w:val="24"/>
-          <w:szCs w:val="24"/>
-          <w:shd w:val="pct15" w:color="auto" w:fill="FFFFFF"/>
-        </w:rPr>
-      </w:pPr>
-      <w:r>
-        <w:rPr>
-          <w:rFonts w:ascii="楷体" w:eastAsia="楷体" w:hAnsi="楷体" w:hint="eastAsia"/>
-          <w:sz w:val="24"/>
-          <w:szCs w:val="24"/>
-          <w:shd w:val="pct15" w:color="auto" w:fill="FFFFFF"/>
-        </w:rPr>
-        <w:t>离忧恼与阎浮提</w:t>
-      </w:r>
-      <w:r>
-        <w:rPr>
-          <w:rFonts w:ascii="楷体" w:eastAsia="楷体" w:hAnsi="楷体" w:hint="eastAsia"/>
-          <w:sz w:val="24"/>
-          <w:szCs w:val="24"/>
-          <w:shd w:val="pct15" w:color="auto" w:fill="FFFFFF"/>
-        </w:rPr>
-        <w:t>。</w:t>
-      </w:r>
-      <w:r>
-        <w:rPr>
-          <w:rFonts w:ascii="楷体" w:eastAsia="楷体" w:hAnsi="楷体" w:hint="eastAsia"/>
-          <w:sz w:val="24"/>
-          <w:szCs w:val="24"/>
-          <w:shd w:val="pct15" w:color="auto" w:fill="FFFFFF"/>
-        </w:rPr>
-        <w:t>超脱一切诸苦趣</w:t>
-      </w:r>
-      <w:r>
-        <w:rPr>
-          <w:rFonts w:ascii="楷体" w:eastAsia="楷体" w:hAnsi="楷体" w:hint="eastAsia"/>
-          <w:sz w:val="24"/>
-          <w:szCs w:val="24"/>
-          <w:shd w:val="pct15" w:color="auto" w:fill="FFFFFF"/>
-        </w:rPr>
-        <w:t>。</w:t>
-      </w:r>
-      <w:r>
-        <w:rPr>
-          <w:rFonts w:ascii="楷体" w:eastAsia="楷体" w:hAnsi="楷体" w:hint="eastAsia"/>
-          <w:sz w:val="24"/>
-          <w:szCs w:val="24"/>
-          <w:shd w:val="pct15" w:color="auto" w:fill="FFFFFF"/>
-        </w:rPr>
-        <w:t>净妙国即极乐界</w:t>
-      </w:r>
-      <w:r>
-        <w:rPr>
-          <w:rFonts w:ascii="楷体" w:eastAsia="楷体" w:hAnsi="楷体" w:hint="eastAsia"/>
-          <w:sz w:val="24"/>
-          <w:szCs w:val="24"/>
-          <w:shd w:val="pct15" w:color="auto" w:fill="FFFFFF"/>
-        </w:rPr>
-        <w:t>。</w:t>
-      </w:r>
-      <w:r>
-        <w:rPr>
-          <w:rFonts w:ascii="楷体" w:eastAsia="楷体" w:hAnsi="楷体" w:hint="eastAsia"/>
-          <w:sz w:val="24"/>
-          <w:szCs w:val="24"/>
-          <w:shd w:val="pct15" w:color="auto" w:fill="FFFFFF"/>
-        </w:rPr>
-        <w:t>修三福发菩提心</w:t>
-      </w:r>
-      <w:r>
-        <w:rPr>
-          <w:rFonts w:ascii="楷体" w:eastAsia="楷体" w:hAnsi="楷体" w:hint="eastAsia"/>
-          <w:sz w:val="24"/>
-          <w:szCs w:val="24"/>
-          <w:shd w:val="pct15" w:color="auto" w:fill="FFFFFF"/>
-        </w:rPr>
-        <w:t>。</w:t>
-      </w:r>
-    </w:p>
-    <w:p>
-      <w:pPr>
-        <w:ind w:firstLineChars="200" w:firstLine="480"/>
-        <w:rPr>
-          <w:rFonts w:ascii="楷体" w:eastAsia="楷体" w:hAnsi="楷体"/>
-          <w:sz w:val="24"/>
-          <w:szCs w:val="24"/>
-          <w:shd w:val="pct15" w:color="auto" w:fill="FFFFFF"/>
-        </w:rPr>
-      </w:pPr>
-      <w:r>
-        <w:rPr>
-          <w:rFonts w:ascii="楷体" w:eastAsia="楷体" w:hAnsi="楷体" w:hint="eastAsia"/>
-          <w:sz w:val="24"/>
-          <w:szCs w:val="24"/>
-          <w:shd w:val="pct15" w:color="auto" w:fill="FFFFFF"/>
-        </w:rPr>
-        <w:t>作是念者住坚专</w:t>
-      </w:r>
-      <w:r>
-        <w:rPr>
-          <w:rFonts w:ascii="楷体" w:eastAsia="楷体" w:hAnsi="楷体" w:hint="eastAsia"/>
-          <w:sz w:val="24"/>
-          <w:szCs w:val="24"/>
-          <w:shd w:val="pct15" w:color="auto" w:fill="FFFFFF"/>
-        </w:rPr>
-        <w:t>。</w:t>
-      </w:r>
-      <w:r>
-        <w:rPr>
-          <w:rFonts w:ascii="楷体" w:eastAsia="楷体" w:hAnsi="楷体" w:hint="eastAsia"/>
-          <w:sz w:val="24"/>
-          <w:szCs w:val="24"/>
-          <w:shd w:val="pct15" w:color="auto" w:fill="FFFFFF"/>
-        </w:rPr>
-        <w:t>故说无量寿佛观</w:t>
-      </w:r>
-      <w:r>
-        <w:rPr>
-          <w:rFonts w:ascii="楷体" w:eastAsia="楷体" w:hAnsi="楷体" w:hint="eastAsia"/>
-          <w:sz w:val="24"/>
-          <w:szCs w:val="24"/>
-          <w:shd w:val="pct15" w:color="auto" w:fill="FFFFFF"/>
-        </w:rPr>
-        <w:t>。</w:t>
-      </w:r>
-      <w:r>
-        <w:rPr>
-          <w:rFonts w:ascii="楷体" w:eastAsia="楷体" w:hAnsi="楷体" w:hint="eastAsia"/>
-          <w:sz w:val="24"/>
-          <w:szCs w:val="24"/>
-          <w:shd w:val="pct15" w:color="auto" w:fill="FFFFFF"/>
-        </w:rPr>
-        <w:t>如是功德不可说</w:t>
-      </w:r>
-      <w:r>
-        <w:rPr>
-          <w:rFonts w:ascii="楷体" w:eastAsia="楷体" w:hAnsi="楷体" w:hint="eastAsia"/>
-          <w:sz w:val="24"/>
-          <w:szCs w:val="24"/>
-          <w:shd w:val="pct15" w:color="auto" w:fill="FFFFFF"/>
-        </w:rPr>
-        <w:t>。</w:t>
-      </w:r>
-      <w:r>
-        <w:rPr>
-          <w:rFonts w:ascii="楷体" w:eastAsia="楷体" w:hAnsi="楷体" w:hint="eastAsia"/>
-          <w:sz w:val="24"/>
-          <w:szCs w:val="24"/>
-          <w:shd w:val="pct15" w:color="auto" w:fill="FFFFFF"/>
-        </w:rPr>
-        <w:t>不可说者妙光明</w:t>
-      </w:r>
-      <w:r>
-        <w:rPr>
-          <w:rFonts w:ascii="楷体" w:eastAsia="楷体" w:hAnsi="楷体" w:hint="eastAsia"/>
-          <w:sz w:val="24"/>
-          <w:szCs w:val="24"/>
-          <w:shd w:val="pct15" w:color="auto" w:fill="FFFFFF"/>
-        </w:rPr>
-        <w:t>。</w:t>
-      </w:r>
-    </w:p>
-    <w:p>
-      <w:pPr>
-        <w:ind w:firstLineChars="200" w:firstLine="480"/>
-        <w:rPr>
-          <w:rFonts w:ascii="楷体" w:eastAsia="楷体" w:hAnsi="楷体"/>
-          <w:sz w:val="24"/>
-          <w:szCs w:val="24"/>
-          <w:shd w:val="pct15" w:color="auto" w:fill="FFFFFF"/>
-        </w:rPr>
-      </w:pPr>
-      <w:r>
-        <w:rPr>
-          <w:rFonts w:ascii="楷体" w:eastAsia="楷体" w:hAnsi="楷体" w:hint="eastAsia"/>
-          <w:sz w:val="24"/>
-          <w:szCs w:val="24"/>
-          <w:shd w:val="pct15" w:color="auto" w:fill="FFFFFF"/>
-        </w:rPr>
-        <w:t>无量清净平等施</w:t>
-      </w:r>
-      <w:r>
-        <w:rPr>
-          <w:rFonts w:ascii="楷体" w:eastAsia="楷体" w:hAnsi="楷体" w:hint="eastAsia"/>
-          <w:sz w:val="24"/>
-          <w:szCs w:val="24"/>
-          <w:shd w:val="pct15" w:color="auto" w:fill="FFFFFF"/>
-        </w:rPr>
-        <w:t>。</w:t>
-      </w:r>
-      <w:r>
-        <w:rPr>
-          <w:rFonts w:ascii="楷体" w:eastAsia="楷体" w:hAnsi="楷体" w:hint="eastAsia"/>
-          <w:sz w:val="24"/>
-          <w:szCs w:val="24"/>
-          <w:shd w:val="pct15" w:color="auto" w:fill="FFFFFF"/>
-        </w:rPr>
-        <w:t>五浊众生咸作佛</w:t>
-      </w:r>
-      <w:r>
-        <w:rPr>
-          <w:rFonts w:ascii="楷体" w:eastAsia="楷体" w:hAnsi="楷体" w:hint="eastAsia"/>
-          <w:sz w:val="24"/>
-          <w:szCs w:val="24"/>
-          <w:shd w:val="pct15" w:color="auto" w:fill="FFFFFF"/>
-        </w:rPr>
-        <w:t>。</w:t>
-      </w:r>
-      <w:r>
-        <w:rPr>
-          <w:rFonts w:ascii="楷体" w:eastAsia="楷体" w:hAnsi="楷体" w:hint="eastAsia"/>
-          <w:sz w:val="24"/>
-          <w:szCs w:val="24"/>
-          <w:shd w:val="pct15" w:color="auto" w:fill="FFFFFF"/>
-        </w:rPr>
-        <w:t>断彼一切颠倒想</w:t>
-      </w:r>
-      <w:r>
-        <w:rPr>
-          <w:rFonts w:ascii="楷体" w:eastAsia="楷体" w:hAnsi="楷体" w:hint="eastAsia"/>
-          <w:sz w:val="24"/>
-          <w:szCs w:val="24"/>
-          <w:shd w:val="pct15" w:color="auto" w:fill="FFFFFF"/>
-        </w:rPr>
-        <w:t>。</w:t>
-      </w:r>
-      <w:r>
-        <w:rPr>
-          <w:rFonts w:ascii="楷体" w:eastAsia="楷体" w:hAnsi="楷体" w:hint="eastAsia"/>
-          <w:sz w:val="24"/>
-          <w:szCs w:val="24"/>
-          <w:shd w:val="pct15" w:color="auto" w:fill="FFFFFF"/>
-        </w:rPr>
-        <w:t>犹如以水投海中</w:t>
-      </w:r>
-      <w:r>
-        <w:rPr>
-          <w:rFonts w:ascii="楷体" w:eastAsia="楷体" w:hAnsi="楷体" w:hint="eastAsia"/>
-          <w:sz w:val="24"/>
-          <w:szCs w:val="24"/>
-          <w:shd w:val="pct15" w:color="auto" w:fill="FFFFFF"/>
-        </w:rPr>
-        <w:t>。</w:t>
-      </w:r>
-    </w:p>
-    <w:p>
-      <w:pPr>
-        <w:ind w:firstLineChars="200" w:firstLine="480"/>
-        <w:rPr>
-          <w:rFonts w:ascii="楷体" w:eastAsia="楷体" w:hAnsi="楷体"/>
-          <w:sz w:val="24"/>
-          <w:szCs w:val="24"/>
-          <w:shd w:val="pct15" w:color="auto" w:fill="FFFFFF"/>
-        </w:rPr>
-      </w:pPr>
-      <w:r>
-        <w:rPr>
-          <w:rFonts w:ascii="楷体" w:eastAsia="楷体" w:hAnsi="楷体" w:hint="eastAsia"/>
-          <w:sz w:val="24"/>
-          <w:szCs w:val="24"/>
-          <w:shd w:val="pct15" w:color="auto" w:fill="FFFFFF"/>
-        </w:rPr>
-        <w:t>湿性混合无不同</w:t>
-      </w:r>
-      <w:r>
-        <w:rPr>
-          <w:rFonts w:ascii="楷体" w:eastAsia="楷体" w:hAnsi="楷体" w:hint="eastAsia"/>
-          <w:sz w:val="24"/>
-          <w:szCs w:val="24"/>
-          <w:shd w:val="pct15" w:color="auto" w:fill="FFFFFF"/>
-        </w:rPr>
-        <w:t>。</w:t>
-      </w:r>
-      <w:r>
-        <w:rPr>
-          <w:rFonts w:ascii="楷体" w:eastAsia="楷体" w:hAnsi="楷体" w:hint="eastAsia"/>
-          <w:sz w:val="24"/>
-          <w:szCs w:val="24"/>
-          <w:shd w:val="pct15" w:color="auto" w:fill="FFFFFF"/>
-        </w:rPr>
-        <w:t>虽有圣智难分别</w:t>
-      </w:r>
-      <w:r>
-        <w:rPr>
-          <w:rFonts w:ascii="楷体" w:eastAsia="楷体" w:hAnsi="楷体" w:hint="eastAsia"/>
-          <w:sz w:val="24"/>
-          <w:szCs w:val="24"/>
-          <w:shd w:val="pct15" w:color="auto" w:fill="FFFFFF"/>
-        </w:rPr>
-        <w:t>。</w:t>
-      </w:r>
-      <w:r>
-        <w:rPr>
-          <w:rFonts w:ascii="楷体" w:eastAsia="楷体" w:hAnsi="楷体" w:hint="eastAsia"/>
-          <w:sz w:val="24"/>
-          <w:szCs w:val="24"/>
-          <w:shd w:val="pct15" w:color="auto" w:fill="FFFFFF"/>
-        </w:rPr>
-        <w:t>人人皆为无量寿</w:t>
-      </w:r>
-      <w:r>
-        <w:rPr>
-          <w:rFonts w:ascii="楷体" w:eastAsia="楷体" w:hAnsi="楷体" w:hint="eastAsia"/>
-          <w:sz w:val="24"/>
-          <w:szCs w:val="24"/>
-          <w:shd w:val="pct15" w:color="auto" w:fill="FFFFFF"/>
-        </w:rPr>
-        <w:t>。</w:t>
-      </w:r>
-      <w:r>
-        <w:rPr>
-          <w:rFonts w:ascii="楷体" w:eastAsia="楷体" w:hAnsi="楷体" w:hint="eastAsia"/>
-          <w:sz w:val="24"/>
-          <w:szCs w:val="24"/>
-          <w:shd w:val="pct15" w:color="auto" w:fill="FFFFFF"/>
-        </w:rPr>
-        <w:t>稽首瞻礼即西方</w:t>
-      </w:r>
-      <w:r>
-        <w:rPr>
-          <w:rFonts w:ascii="楷体" w:eastAsia="楷体" w:hAnsi="楷体" w:hint="eastAsia"/>
-          <w:sz w:val="24"/>
-          <w:szCs w:val="24"/>
-          <w:shd w:val="pct15" w:color="auto" w:fill="FFFFFF"/>
-        </w:rPr>
-        <w:t>。</w:t>
-      </w:r>
-    </w:p>
-    <w:p>
-      <w:pPr>
-        <w:rPr>
-          <w:rFonts w:ascii="楷体" w:eastAsia="楷体" w:hAnsi="楷体" w:hint="eastAsia"/>
-          <w:sz w:val="24"/>
-          <w:szCs w:val="24"/>
-          <w:shd w:val="pct15" w:color="auto" w:fill="FFFFFF"/>
-        </w:rPr>
-      </w:pPr>
     </w:p>
     <w:sectPr>
       <w:pgSz w:w="11906" w:h="16838"/>

</xml_diff>